<commit_message>
MAX98357A direkt auf die Versorgungsreihe des ESP
Pinbelegung so umgestellt, dass der MAX98357A ohne Kabel auf
5V, GND, 3V3 und die folgenden vier GPIOs geloetet wird
(VIN-5V, GND-GND, SD-3V3, GAIN, DIN, BCLK, LRC). Neues Bild
max_direkt, Dokument und README angepasst.

pins.h: I2S auf 2/3/4, GAIN 1, Port B 7/8, WLAN 9, GPS 44/43.
main.cpp: GAIN-Pin als Eingang ohne Pull-up (9 dB).

Co-Authored-By: Claude Opus 5.5 (1M context) <noreply@anthropic.com>
Claude-Session: https://claude.ai/code/session_01Ty5RYkDwYVKc2svXrgQ3BJ
</commit_message>
<xml_diff>
--- a/docs/Hardware-Bauplan_Mini-S3.docx
+++ b/docs/Hardware-Bauplan_Mini-S3.docx
@@ -101,7 +101,7 @@
                 <w:sz w:val="21"/>
                 <w:szCs w:val="21"/>
               </w:rPr>
-              <w:t xml:space="preserve">Die Pinbelegung stammt aus der Firmware (firmware/src/pins.h, Stand main). Sie ist dort als vorläufig markiert: Schritt 5 des Projektplans prüft sie am echten Board. Einen KiCad-Schaltplan gibt es noch nicht; die Grafiken sind aus pins.h gezeichnet.</w:t>
+              <w:t xml:space="preserve">Die Pinbelegung steht in der Firmware (firmware/src/pins.h) und ist so gewählt, dass der MAX98357A direkt auf der Versorgungsreihe des S3-Zero sitzt. Die Reihenfolge der Header-Pins stammt aus dem Footprint im Repo RC-Multiswitch-ESP32-S3 (laut Waveshare-Pinout). Einen KiCad-Schaltplan für das Mini gibt es noch nicht; die Grafiken sind aus pins.h gezeichnet.</w:t>
             </w:r>
           </w:p>
         </w:tc>
@@ -535,7 +535,7 @@
                 <w:sz w:val="19"/>
                 <w:szCs w:val="19"/>
               </w:rPr>
-              <w:t xml:space="preserve">Verstärker bis ca. 3 W an 4 Ω</w:t>
+              <w:t xml:space="preserve">Pinreihe LRC, BCLK, DIN, GAIN, SD, GND, VIN (Adafruit-Layout)</w:t>
             </w:r>
           </w:p>
         </w:tc>
@@ -1894,7 +1894,7 @@
                 <w:sz w:val="19"/>
                 <w:szCs w:val="19"/>
               </w:rPr>
-              <w:t xml:space="preserve">Port A: CRSF RX</w:t>
+              <w:t xml:space="preserve">MAX VIN</w:t>
             </w:r>
           </w:p>
         </w:tc>
@@ -1924,7 +1924,7 @@
                 <w:sz w:val="19"/>
                 <w:szCs w:val="19"/>
               </w:rPr>
-              <w:t xml:space="preserve">GPIO5</w:t>
+              <w:t xml:space="preserve">5V</w:t>
             </w:r>
           </w:p>
         </w:tc>
@@ -1954,7 +1954,7 @@
                 <w:sz w:val="19"/>
                 <w:szCs w:val="19"/>
               </w:rPr>
-              <w:t xml:space="preserve">Eingang</w:t>
+              <w:t xml:space="preserve">Versorgung</w:t>
             </w:r>
           </w:p>
         </w:tc>
@@ -1984,7 +1984,7 @@
                 <w:sz w:val="19"/>
                 <w:szCs w:val="19"/>
               </w:rPr>
-              <w:t xml:space="preserve">Empfänger TX</w:t>
+              <w:t xml:space="preserve">MAX98357A VIN</w:t>
             </w:r>
           </w:p>
         </w:tc>
@@ -2014,7 +2014,7 @@
                 <w:sz w:val="19"/>
                 <w:szCs w:val="19"/>
               </w:rPr>
-              <w:t xml:space="preserve">Hardware-UART</w:t>
+              <w:t xml:space="preserve">MAX direkt aufgelötet</w:t>
             </w:r>
           </w:p>
         </w:tc>
@@ -2047,7 +2047,7 @@
                 <w:sz w:val="19"/>
                 <w:szCs w:val="19"/>
               </w:rPr>
-              <w:t xml:space="preserve">Port A: CRSF TX</w:t>
+              <w:t xml:space="preserve">MAX GND</w:t>
             </w:r>
           </w:p>
         </w:tc>
@@ -2078,7 +2078,7 @@
                 <w:sz w:val="19"/>
                 <w:szCs w:val="19"/>
               </w:rPr>
-              <w:t xml:space="preserve">GPIO6</w:t>
+              <w:t xml:space="preserve">GND</w:t>
             </w:r>
           </w:p>
         </w:tc>
@@ -2109,7 +2109,7 @@
                 <w:sz w:val="19"/>
                 <w:szCs w:val="19"/>
               </w:rPr>
-              <w:t xml:space="preserve">Ausgang</w:t>
+              <w:t xml:space="preserve">Masse</w:t>
             </w:r>
           </w:p>
         </w:tc>
@@ -2140,7 +2140,7 @@
                 <w:sz w:val="19"/>
                 <w:szCs w:val="19"/>
               </w:rPr>
-              <w:t xml:space="preserve">Empfänger RX</w:t>
+              <w:t xml:space="preserve">MAX98357A GND</w:t>
             </w:r>
           </w:p>
         </w:tc>
@@ -2171,7 +2171,7 @@
                 <w:sz w:val="19"/>
                 <w:szCs w:val="19"/>
               </w:rPr>
-              <w:t xml:space="preserve"/>
+              <w:t xml:space="preserve">MAX direkt aufgelötet</w:t>
             </w:r>
           </w:p>
         </w:tc>
@@ -2203,7 +2203,7 @@
                 <w:sz w:val="19"/>
                 <w:szCs w:val="19"/>
               </w:rPr>
-              <w:t xml:space="preserve">Port B: RX</w:t>
+              <w:t xml:space="preserve">MAX SD</w:t>
             </w:r>
           </w:p>
         </w:tc>
@@ -2233,7 +2233,7 @@
                 <w:sz w:val="19"/>
                 <w:szCs w:val="19"/>
               </w:rPr>
-              <w:t xml:space="preserve">GPIO1</w:t>
+              <w:t xml:space="preserve">3V3</w:t>
             </w:r>
           </w:p>
         </w:tc>
@@ -2263,7 +2263,7 @@
                 <w:sz w:val="19"/>
                 <w:szCs w:val="19"/>
               </w:rPr>
-              <w:t xml:space="preserve">Eingang</w:t>
+              <w:t xml:space="preserve">Versorgung</w:t>
             </w:r>
           </w:p>
         </w:tc>
@@ -2293,7 +2293,7 @@
                 <w:sz w:val="19"/>
                 <w:szCs w:val="19"/>
               </w:rPr>
-              <w:t xml:space="preserve">Geräte-TX / S.Port-Signal</w:t>
+              <w:t xml:space="preserve">MAX98357A SD</w:t>
             </w:r>
           </w:p>
         </w:tc>
@@ -2323,7 +2323,7 @@
                 <w:sz w:val="19"/>
                 <w:szCs w:val="19"/>
               </w:rPr>
-              <w:t xml:space="preserve">Hardware-UART (Serial1)</w:t>
+              <w:t xml:space="preserve">Verstärker immer an</w:t>
             </w:r>
           </w:p>
         </w:tc>
@@ -2356,7 +2356,7 @@
                 <w:sz w:val="19"/>
                 <w:szCs w:val="19"/>
               </w:rPr>
-              <w:t xml:space="preserve">Port B: TX</w:t>
+              <w:t xml:space="preserve">MAX GAIN</w:t>
             </w:r>
           </w:p>
         </w:tc>
@@ -2387,7 +2387,7 @@
                 <w:sz w:val="19"/>
                 <w:szCs w:val="19"/>
               </w:rPr>
-              <w:t xml:space="preserve">GPIO2</w:t>
+              <w:t xml:space="preserve">GPIO1</w:t>
             </w:r>
           </w:p>
         </w:tc>
@@ -2418,7 +2418,7 @@
                 <w:sz w:val="19"/>
                 <w:szCs w:val="19"/>
               </w:rPr>
-              <w:t xml:space="preserve">Ausgang</w:t>
+              <w:t xml:space="preserve">Eingang (offen)</w:t>
             </w:r>
           </w:p>
         </w:tc>
@@ -2449,7 +2449,7 @@
                 <w:sz w:val="19"/>
                 <w:szCs w:val="19"/>
               </w:rPr>
-              <w:t xml:space="preserve">Geräte-RX / über 1N4148 an S.Port</w:t>
+              <w:t xml:space="preserve">MAX98357A GAIN</w:t>
             </w:r>
           </w:p>
         </w:tc>
@@ -2480,7 +2480,7 @@
                 <w:sz w:val="19"/>
                 <w:szCs w:val="19"/>
               </w:rPr>
-              <w:t xml:space="preserve"/>
+              <w:t xml:space="preserve">offen = 9 dB</w:t>
             </w:r>
           </w:p>
         </w:tc>
@@ -2512,7 +2512,7 @@
                 <w:sz w:val="19"/>
                 <w:szCs w:val="19"/>
               </w:rPr>
-              <w:t xml:space="preserve">Port C: GPS RX</w:t>
+              <w:t xml:space="preserve">I2S DOUT</w:t>
             </w:r>
           </w:p>
         </w:tc>
@@ -2542,7 +2542,7 @@
                 <w:sz w:val="19"/>
                 <w:szCs w:val="19"/>
               </w:rPr>
-              <w:t xml:space="preserve">GPIO14</w:t>
+              <w:t xml:space="preserve">GPIO2</w:t>
             </w:r>
           </w:p>
         </w:tc>
@@ -2572,7 +2572,7 @@
                 <w:sz w:val="19"/>
                 <w:szCs w:val="19"/>
               </w:rPr>
-              <w:t xml:space="preserve">Eingang</w:t>
+              <w:t xml:space="preserve">Ausgang</w:t>
             </w:r>
           </w:p>
         </w:tc>
@@ -2602,7 +2602,7 @@
                 <w:sz w:val="19"/>
                 <w:szCs w:val="19"/>
               </w:rPr>
-              <w:t xml:space="preserve">GPS TX</w:t>
+              <w:t xml:space="preserve">MAX98357A DIN</w:t>
             </w:r>
           </w:p>
         </w:tc>
@@ -2632,7 +2632,7 @@
                 <w:sz w:val="19"/>
                 <w:szCs w:val="19"/>
               </w:rPr>
-              <w:t xml:space="preserve">GPS-Konfiguration wird gesendet</w:t>
+              <w:t xml:space="preserve">MAX direkt aufgelötet</w:t>
             </w:r>
           </w:p>
         </w:tc>
@@ -2665,7 +2665,7 @@
                 <w:sz w:val="19"/>
                 <w:szCs w:val="19"/>
               </w:rPr>
-              <w:t xml:space="preserve">Port C: GPS TX</w:t>
+              <w:t xml:space="preserve">I2S BCLK</w:t>
             </w:r>
           </w:p>
         </w:tc>
@@ -2696,7 +2696,7 @@
                 <w:sz w:val="19"/>
                 <w:szCs w:val="19"/>
               </w:rPr>
-              <w:t xml:space="preserve">GPIO15</w:t>
+              <w:t xml:space="preserve">GPIO3</w:t>
             </w:r>
           </w:p>
         </w:tc>
@@ -2758,7 +2758,7 @@
                 <w:sz w:val="19"/>
                 <w:szCs w:val="19"/>
               </w:rPr>
-              <w:t xml:space="preserve">GPS RX</w:t>
+              <w:t xml:space="preserve">MAX98357A BCLK</w:t>
             </w:r>
           </w:p>
         </w:tc>
@@ -2789,7 +2789,7 @@
                 <w:sz w:val="19"/>
                 <w:szCs w:val="19"/>
               </w:rPr>
-              <w:t xml:space="preserve"/>
+              <w:t xml:space="preserve">MAX direkt aufgelötet</w:t>
             </w:r>
           </w:p>
         </w:tc>
@@ -2821,7 +2821,7 @@
                 <w:sz w:val="19"/>
                 <w:szCs w:val="19"/>
               </w:rPr>
-              <w:t xml:space="preserve">I2S BCLK</w:t>
+              <w:t xml:space="preserve">I2S LRC</w:t>
             </w:r>
           </w:p>
         </w:tc>
@@ -2851,7 +2851,7 @@
                 <w:sz w:val="19"/>
                 <w:szCs w:val="19"/>
               </w:rPr>
-              <w:t xml:space="preserve">GPIO7</w:t>
+              <w:t xml:space="preserve">GPIO4</w:t>
             </w:r>
           </w:p>
         </w:tc>
@@ -2911,7 +2911,7 @@
                 <w:sz w:val="19"/>
                 <w:szCs w:val="19"/>
               </w:rPr>
-              <w:t xml:space="preserve">MAX98357A BCLK</w:t>
+              <w:t xml:space="preserve">MAX98357A LRC</w:t>
             </w:r>
           </w:p>
         </w:tc>
@@ -2941,7 +2941,7 @@
                 <w:sz w:val="19"/>
                 <w:szCs w:val="19"/>
               </w:rPr>
-              <w:t xml:space="preserve">kurze Leitung</w:t>
+              <w:t xml:space="preserve">MAX direkt aufgelötet</w:t>
             </w:r>
           </w:p>
         </w:tc>
@@ -2974,7 +2974,7 @@
                 <w:sz w:val="19"/>
                 <w:szCs w:val="19"/>
               </w:rPr>
-              <w:t xml:space="preserve">I2S LRC</w:t>
+              <w:t xml:space="preserve">Port A: CRSF RX</w:t>
             </w:r>
           </w:p>
         </w:tc>
@@ -3005,7 +3005,7 @@
                 <w:sz w:val="19"/>
                 <w:szCs w:val="19"/>
               </w:rPr>
-              <w:t xml:space="preserve">GPIO8</w:t>
+              <w:t xml:space="preserve">GPIO5</w:t>
             </w:r>
           </w:p>
         </w:tc>
@@ -3036,7 +3036,7 @@
                 <w:sz w:val="19"/>
                 <w:szCs w:val="19"/>
               </w:rPr>
-              <w:t xml:space="preserve">Ausgang</w:t>
+              <w:t xml:space="preserve">Eingang</w:t>
             </w:r>
           </w:p>
         </w:tc>
@@ -3067,7 +3067,7 @@
                 <w:sz w:val="19"/>
                 <w:szCs w:val="19"/>
               </w:rPr>
-              <w:t xml:space="preserve">MAX98357A LRC</w:t>
+              <w:t xml:space="preserve">Empfänger TX</w:t>
             </w:r>
           </w:p>
         </w:tc>
@@ -3098,7 +3098,7 @@
                 <w:sz w:val="19"/>
                 <w:szCs w:val="19"/>
               </w:rPr>
-              <w:t xml:space="preserve">kurze Leitung</w:t>
+              <w:t xml:space="preserve">Hardware-UART</w:t>
             </w:r>
           </w:p>
         </w:tc>
@@ -3130,7 +3130,7 @@
                 <w:sz w:val="19"/>
                 <w:szCs w:val="19"/>
               </w:rPr>
-              <w:t xml:space="preserve">I2S DOUT</w:t>
+              <w:t xml:space="preserve">Port A: CRSF TX</w:t>
             </w:r>
           </w:p>
         </w:tc>
@@ -3160,7 +3160,7 @@
                 <w:sz w:val="19"/>
                 <w:szCs w:val="19"/>
               </w:rPr>
-              <w:t xml:space="preserve">GPIO9</w:t>
+              <w:t xml:space="preserve">GPIO6</w:t>
             </w:r>
           </w:p>
         </w:tc>
@@ -3220,7 +3220,7 @@
                 <w:sz w:val="19"/>
                 <w:szCs w:val="19"/>
               </w:rPr>
-              <w:t xml:space="preserve">MAX98357A DIN</w:t>
+              <w:t xml:space="preserve">Empfänger RX</w:t>
             </w:r>
           </w:p>
         </w:tc>
@@ -3250,7 +3250,7 @@
                 <w:sz w:val="19"/>
                 <w:szCs w:val="19"/>
               </w:rPr>
-              <w:t xml:space="preserve">kurze Leitung</w:t>
+              <w:t xml:space="preserve"/>
             </w:r>
           </w:p>
         </w:tc>
@@ -3283,7 +3283,7 @@
                 <w:sz w:val="19"/>
                 <w:szCs w:val="19"/>
               </w:rPr>
-              <w:t xml:space="preserve">SD CS</w:t>
+              <w:t xml:space="preserve">Port B: RX</w:t>
             </w:r>
           </w:p>
         </w:tc>
@@ -3314,7 +3314,7 @@
                 <w:sz w:val="19"/>
                 <w:szCs w:val="19"/>
               </w:rPr>
-              <w:t xml:space="preserve">GPIO10</w:t>
+              <w:t xml:space="preserve">GPIO7</w:t>
             </w:r>
           </w:p>
         </w:tc>
@@ -3345,7 +3345,7 @@
                 <w:sz w:val="19"/>
                 <w:szCs w:val="19"/>
               </w:rPr>
-              <w:t xml:space="preserve">Ausgang</w:t>
+              <w:t xml:space="preserve">Eingang</w:t>
             </w:r>
           </w:p>
         </w:tc>
@@ -3376,7 +3376,7 @@
                 <w:sz w:val="19"/>
                 <w:szCs w:val="19"/>
               </w:rPr>
-              <w:t xml:space="preserve">SD-Modul CS</w:t>
+              <w:t xml:space="preserve">Geräte-TX / S.Port-Signal</w:t>
             </w:r>
           </w:p>
         </w:tc>
@@ -3407,7 +3407,7 @@
                 <w:sz w:val="19"/>
                 <w:szCs w:val="19"/>
               </w:rPr>
-              <w:t xml:space="preserve">nur mit SD-Karte</w:t>
+              <w:t xml:space="preserve">Hardware-UART (Serial1)</w:t>
             </w:r>
           </w:p>
         </w:tc>
@@ -3439,7 +3439,7 @@
                 <w:sz w:val="19"/>
                 <w:szCs w:val="19"/>
               </w:rPr>
-              <w:t xml:space="preserve">SD MOSI</w:t>
+              <w:t xml:space="preserve">Port B: TX</w:t>
             </w:r>
           </w:p>
         </w:tc>
@@ -3469,7 +3469,7 @@
                 <w:sz w:val="19"/>
                 <w:szCs w:val="19"/>
               </w:rPr>
-              <w:t xml:space="preserve">GPIO11</w:t>
+              <w:t xml:space="preserve">GPIO8</w:t>
             </w:r>
           </w:p>
         </w:tc>
@@ -3529,7 +3529,7 @@
                 <w:sz w:val="19"/>
                 <w:szCs w:val="19"/>
               </w:rPr>
-              <w:t xml:space="preserve">SD-Modul MOSI</w:t>
+              <w:t xml:space="preserve">Geräte-RX / über 1N4148 an S.Port</w:t>
             </w:r>
           </w:p>
         </w:tc>
@@ -3559,7 +3559,7 @@
                 <w:sz w:val="19"/>
                 <w:szCs w:val="19"/>
               </w:rPr>
-              <w:t xml:space="preserve">Standard-SPI des S3</w:t>
+              <w:t xml:space="preserve"/>
             </w:r>
           </w:p>
         </w:tc>
@@ -3592,7 +3592,7 @@
                 <w:sz w:val="19"/>
                 <w:szCs w:val="19"/>
               </w:rPr>
-              <w:t xml:space="preserve">SD SCK</w:t>
+              <w:t xml:space="preserve">WLAN-Brücke</w:t>
             </w:r>
           </w:p>
         </w:tc>
@@ -3623,7 +3623,7 @@
                 <w:sz w:val="19"/>
                 <w:szCs w:val="19"/>
               </w:rPr>
-              <w:t xml:space="preserve">GPIO12</w:t>
+              <w:t xml:space="preserve">GPIO9</w:t>
             </w:r>
           </w:p>
         </w:tc>
@@ -3654,7 +3654,7 @@
                 <w:sz w:val="19"/>
                 <w:szCs w:val="19"/>
               </w:rPr>
-              <w:t xml:space="preserve">Ausgang</w:t>
+              <w:t xml:space="preserve">Eingang (Pull-up)</w:t>
             </w:r>
           </w:p>
         </w:tc>
@@ -3685,7 +3685,7 @@
                 <w:sz w:val="19"/>
                 <w:szCs w:val="19"/>
               </w:rPr>
-              <w:t xml:space="preserve">SD-Modul SCK</w:t>
+              <w:t xml:space="preserve">Brücke nach GND</w:t>
             </w:r>
           </w:p>
         </w:tc>
@@ -3716,7 +3716,7 @@
                 <w:sz w:val="19"/>
                 <w:szCs w:val="19"/>
               </w:rPr>
-              <w:t xml:space="preserve"/>
+              <w:t xml:space="preserve">gesteckt beim Einschalten = WLAN an</w:t>
             </w:r>
           </w:p>
         </w:tc>
@@ -3748,7 +3748,7 @@
                 <w:sz w:val="19"/>
                 <w:szCs w:val="19"/>
               </w:rPr>
-              <w:t xml:space="preserve">SD MISO</w:t>
+              <w:t xml:space="preserve">SD CS</w:t>
             </w:r>
           </w:p>
         </w:tc>
@@ -3778,7 +3778,7 @@
                 <w:sz w:val="19"/>
                 <w:szCs w:val="19"/>
               </w:rPr>
-              <w:t xml:space="preserve">GPIO13</w:t>
+              <w:t xml:space="preserve">GPIO10</w:t>
             </w:r>
           </w:p>
         </w:tc>
@@ -3808,7 +3808,7 @@
                 <w:sz w:val="19"/>
                 <w:szCs w:val="19"/>
               </w:rPr>
-              <w:t xml:space="preserve">Eingang</w:t>
+              <w:t xml:space="preserve">Ausgang</w:t>
             </w:r>
           </w:p>
         </w:tc>
@@ -3838,7 +3838,7 @@
                 <w:sz w:val="19"/>
                 <w:szCs w:val="19"/>
               </w:rPr>
-              <w:t xml:space="preserve">SD-Modul MISO</w:t>
+              <w:t xml:space="preserve">SD-Modul CS</w:t>
             </w:r>
           </w:p>
         </w:tc>
@@ -3868,7 +3868,7 @@
                 <w:sz w:val="19"/>
                 <w:szCs w:val="19"/>
               </w:rPr>
-              <w:t xml:space="preserve"/>
+              <w:t xml:space="preserve">nur mit SD-Karte</w:t>
             </w:r>
           </w:p>
         </w:tc>
@@ -3901,7 +3901,7 @@
                 <w:sz w:val="19"/>
                 <w:szCs w:val="19"/>
               </w:rPr>
-              <w:t xml:space="preserve">WLAN-Brücke</w:t>
+              <w:t xml:space="preserve">SD MOSI</w:t>
             </w:r>
           </w:p>
         </w:tc>
@@ -3932,7 +3932,7 @@
                 <w:sz w:val="19"/>
                 <w:szCs w:val="19"/>
               </w:rPr>
-              <w:t xml:space="preserve">GPIO4</w:t>
+              <w:t xml:space="preserve">GPIO11</w:t>
             </w:r>
           </w:p>
         </w:tc>
@@ -3963,7 +3963,7 @@
                 <w:sz w:val="19"/>
                 <w:szCs w:val="19"/>
               </w:rPr>
-              <w:t xml:space="preserve">Eingang (Pull-up)</w:t>
+              <w:t xml:space="preserve">Ausgang</w:t>
             </w:r>
           </w:p>
         </w:tc>
@@ -3994,7 +3994,7 @@
                 <w:sz w:val="19"/>
                 <w:szCs w:val="19"/>
               </w:rPr>
-              <w:t xml:space="preserve">Brücke nach GND</w:t>
+              <w:t xml:space="preserve">SD-Modul MOSI</w:t>
             </w:r>
           </w:p>
         </w:tc>
@@ -4025,7 +4025,7 @@
                 <w:sz w:val="19"/>
                 <w:szCs w:val="19"/>
               </w:rPr>
-              <w:t xml:space="preserve">gesteckt beim Einschalten = WLAN an</w:t>
+              <w:t xml:space="preserve">Standard-SPI des S3</w:t>
             </w:r>
           </w:p>
         </w:tc>
@@ -4057,7 +4057,7 @@
                 <w:sz w:val="19"/>
                 <w:szCs w:val="19"/>
               </w:rPr>
-              <w:t xml:space="preserve">Versorgung</w:t>
+              <w:t xml:space="preserve">SD SCK</w:t>
             </w:r>
           </w:p>
         </w:tc>
@@ -4087,7 +4087,7 @@
                 <w:sz w:val="19"/>
                 <w:szCs w:val="19"/>
               </w:rPr>
-              <w:t xml:space="preserve">5V</w:t>
+              <w:t xml:space="preserve">GPIO12</w:t>
             </w:r>
           </w:p>
         </w:tc>
@@ -4117,7 +4117,7 @@
                 <w:sz w:val="19"/>
                 <w:szCs w:val="19"/>
               </w:rPr>
-              <w:t xml:space="preserve">Eingang</w:t>
+              <w:t xml:space="preserve">Ausgang</w:t>
             </w:r>
           </w:p>
         </w:tc>
@@ -4147,7 +4147,7 @@
                 <w:sz w:val="19"/>
                 <w:szCs w:val="19"/>
               </w:rPr>
-              <w:t xml:space="preserve">+5 V vom BEC</w:t>
+              <w:t xml:space="preserve">SD-Modul SCK</w:t>
             </w:r>
           </w:p>
         </w:tc>
@@ -4210,7 +4210,7 @@
                 <w:sz w:val="19"/>
                 <w:szCs w:val="19"/>
               </w:rPr>
-              <w:t xml:space="preserve">Versorgung</w:t>
+              <w:t xml:space="preserve">SD MISO</w:t>
             </w:r>
           </w:p>
         </w:tc>
@@ -4241,7 +4241,7 @@
                 <w:sz w:val="19"/>
                 <w:szCs w:val="19"/>
               </w:rPr>
-              <w:t xml:space="preserve">3V3</w:t>
+              <w:t xml:space="preserve">GPIO13</w:t>
             </w:r>
           </w:p>
         </w:tc>
@@ -4272,7 +4272,7 @@
                 <w:sz w:val="19"/>
                 <w:szCs w:val="19"/>
               </w:rPr>
-              <w:t xml:space="preserve">Ausgang</w:t>
+              <w:t xml:space="preserve">Eingang</w:t>
             </w:r>
           </w:p>
         </w:tc>
@@ -4303,7 +4303,7 @@
                 <w:sz w:val="19"/>
                 <w:szCs w:val="19"/>
               </w:rPr>
-              <w:t xml:space="preserve">SD-Modul (3,3-V-Typ)</w:t>
+              <w:t xml:space="preserve">SD-Modul MISO</w:t>
             </w:r>
           </w:p>
         </w:tc>
@@ -4334,7 +4334,7 @@
                 <w:sz w:val="19"/>
                 <w:szCs w:val="19"/>
               </w:rPr>
-              <w:t xml:space="preserve">sonst nichts anschließen</w:t>
+              <w:t xml:space="preserve"/>
             </w:r>
           </w:p>
         </w:tc>
@@ -4366,7 +4366,7 @@
                 <w:sz w:val="19"/>
                 <w:szCs w:val="19"/>
               </w:rPr>
-              <w:t xml:space="preserve">Masse</w:t>
+              <w:t xml:space="preserve">Port C: GPS RX</w:t>
             </w:r>
           </w:p>
         </w:tc>
@@ -4396,7 +4396,7 @@
                 <w:sz w:val="19"/>
                 <w:szCs w:val="19"/>
               </w:rPr>
-              <w:t xml:space="preserve">GND</w:t>
+              <w:t xml:space="preserve">GPIO44 (RX)</w:t>
             </w:r>
           </w:p>
         </w:tc>
@@ -4426,7 +4426,7 @@
                 <w:sz w:val="19"/>
                 <w:szCs w:val="19"/>
               </w:rPr>
-              <w:t xml:space="preserve"/>
+              <w:t xml:space="preserve">Eingang</w:t>
             </w:r>
           </w:p>
         </w:tc>
@@ -4456,7 +4456,7 @@
                 <w:sz w:val="19"/>
                 <w:szCs w:val="19"/>
               </w:rPr>
-              <w:t xml:space="preserve">alle Geräte</w:t>
+              <w:t xml:space="preserve">GPS TX</w:t>
             </w:r>
           </w:p>
         </w:tc>
@@ -4486,7 +4486,164 @@
                 <w:sz w:val="19"/>
                 <w:szCs w:val="19"/>
               </w:rPr>
-              <w:t xml:space="preserve"/>
+              <w:t xml:space="preserve">Software-UART</w:t>
+            </w:r>
+          </w:p>
+        </w:tc>
+      </w:tr>
+      <w:tr>
+        <w:tc>
+          <w:tcPr>
+            <w:tcW w:type="dxa" w:w="1900"/>
+            <w:tcBorders>
+              <w:top w:val="single" w:color="CBD5E1" w:sz="4"/>
+              <w:left w:val="single" w:color="CBD5E1" w:sz="4"/>
+              <w:bottom w:val="single" w:color="CBD5E1" w:sz="4"/>
+              <w:right w:val="single" w:color="CBD5E1" w:sz="4"/>
+            </w:tcBorders>
+            <w:shd w:fill="F1F5F9" w:color="auto" w:val="clear"/>
+            <w:tcMar>
+              <w:top w:type="dxa" w:w="60"/>
+              <w:left w:type="dxa" w:w="100"/>
+              <w:bottom w:type="dxa" w:w="60"/>
+              <w:right w:type="dxa" w:w="100"/>
+            </w:tcMar>
+          </w:tcPr>
+          <w:p>
+            <w:r>
+              <w:rPr>
+                <w:rFonts w:ascii="Arial" w:cs="Arial" w:eastAsia="Arial" w:hAnsi="Arial"/>
+                <w:b w:val="false"/>
+                <w:bCs w:val="false"/>
+                <w:color w:val="0F172A"/>
+                <w:sz w:val="19"/>
+                <w:szCs w:val="19"/>
+              </w:rPr>
+              <w:t xml:space="preserve">Port C: GPS TX</w:t>
+            </w:r>
+          </w:p>
+        </w:tc>
+        <w:tc>
+          <w:tcPr>
+            <w:tcW w:type="dxa" w:w="1150"/>
+            <w:tcBorders>
+              <w:top w:val="single" w:color="CBD5E1" w:sz="4"/>
+              <w:left w:val="single" w:color="CBD5E1" w:sz="4"/>
+              <w:bottom w:val="single" w:color="CBD5E1" w:sz="4"/>
+              <w:right w:val="single" w:color="CBD5E1" w:sz="4"/>
+            </w:tcBorders>
+            <w:shd w:fill="F1F5F9" w:color="auto" w:val="clear"/>
+            <w:tcMar>
+              <w:top w:type="dxa" w:w="60"/>
+              <w:left w:type="dxa" w:w="100"/>
+              <w:bottom w:type="dxa" w:w="60"/>
+              <w:right w:type="dxa" w:w="100"/>
+            </w:tcMar>
+          </w:tcPr>
+          <w:p>
+            <w:r>
+              <w:rPr>
+                <w:rFonts w:ascii="Arial" w:cs="Arial" w:eastAsia="Arial" w:hAnsi="Arial"/>
+                <w:b/>
+                <w:bCs/>
+                <w:color w:val="0F172A"/>
+                <w:sz w:val="19"/>
+                <w:szCs w:val="19"/>
+              </w:rPr>
+              <w:t xml:space="preserve">GPIO43 (TX)</w:t>
+            </w:r>
+          </w:p>
+        </w:tc>
+        <w:tc>
+          <w:tcPr>
+            <w:tcW w:type="dxa" w:w="1300"/>
+            <w:tcBorders>
+              <w:top w:val="single" w:color="CBD5E1" w:sz="4"/>
+              <w:left w:val="single" w:color="CBD5E1" w:sz="4"/>
+              <w:bottom w:val="single" w:color="CBD5E1" w:sz="4"/>
+              <w:right w:val="single" w:color="CBD5E1" w:sz="4"/>
+            </w:tcBorders>
+            <w:shd w:fill="F1F5F9" w:color="auto" w:val="clear"/>
+            <w:tcMar>
+              <w:top w:type="dxa" w:w="60"/>
+              <w:left w:type="dxa" w:w="100"/>
+              <w:bottom w:type="dxa" w:w="60"/>
+              <w:right w:type="dxa" w:w="100"/>
+            </w:tcMar>
+          </w:tcPr>
+          <w:p>
+            <w:r>
+              <w:rPr>
+                <w:rFonts w:ascii="Arial" w:cs="Arial" w:eastAsia="Arial" w:hAnsi="Arial"/>
+                <w:b w:val="false"/>
+                <w:bCs w:val="false"/>
+                <w:color w:val="0F172A"/>
+                <w:sz w:val="19"/>
+                <w:szCs w:val="19"/>
+              </w:rPr>
+              <w:t xml:space="preserve">Ausgang</w:t>
+            </w:r>
+          </w:p>
+        </w:tc>
+        <w:tc>
+          <w:tcPr>
+            <w:tcW w:type="dxa" w:w="2300"/>
+            <w:tcBorders>
+              <w:top w:val="single" w:color="CBD5E1" w:sz="4"/>
+              <w:left w:val="single" w:color="CBD5E1" w:sz="4"/>
+              <w:bottom w:val="single" w:color="CBD5E1" w:sz="4"/>
+              <w:right w:val="single" w:color="CBD5E1" w:sz="4"/>
+            </w:tcBorders>
+            <w:shd w:fill="F1F5F9" w:color="auto" w:val="clear"/>
+            <w:tcMar>
+              <w:top w:type="dxa" w:w="60"/>
+              <w:left w:type="dxa" w:w="100"/>
+              <w:bottom w:type="dxa" w:w="60"/>
+              <w:right w:type="dxa" w:w="100"/>
+            </w:tcMar>
+          </w:tcPr>
+          <w:p>
+            <w:r>
+              <w:rPr>
+                <w:rFonts w:ascii="Arial" w:cs="Arial" w:eastAsia="Arial" w:hAnsi="Arial"/>
+                <w:b w:val="false"/>
+                <w:bCs w:val="false"/>
+                <w:color w:val="0F172A"/>
+                <w:sz w:val="19"/>
+                <w:szCs w:val="19"/>
+              </w:rPr>
+              <w:t xml:space="preserve">GPS RX</w:t>
+            </w:r>
+          </w:p>
+        </w:tc>
+        <w:tc>
+          <w:tcPr>
+            <w:tcW w:type="dxa" w:w="2376"/>
+            <w:tcBorders>
+              <w:top w:val="single" w:color="CBD5E1" w:sz="4"/>
+              <w:left w:val="single" w:color="CBD5E1" w:sz="4"/>
+              <w:bottom w:val="single" w:color="CBD5E1" w:sz="4"/>
+              <w:right w:val="single" w:color="CBD5E1" w:sz="4"/>
+            </w:tcBorders>
+            <w:shd w:fill="F1F5F9" w:color="auto" w:val="clear"/>
+            <w:tcMar>
+              <w:top w:type="dxa" w:w="60"/>
+              <w:left w:type="dxa" w:w="100"/>
+              <w:bottom w:type="dxa" w:w="60"/>
+              <w:right w:type="dxa" w:w="100"/>
+            </w:tcMar>
+          </w:tcPr>
+          <w:p>
+            <w:r>
+              <w:rPr>
+                <w:rFonts w:ascii="Arial" w:cs="Arial" w:eastAsia="Arial" w:hAnsi="Arial"/>
+                <w:b w:val="false"/>
+                <w:bCs w:val="false"/>
+                <w:color w:val="0F172A"/>
+                <w:sz w:val="19"/>
+                <w:szCs w:val="19"/>
+              </w:rPr>
+              <w:t xml:space="preserve">GPS-Konfiguration wird gesendet</w:t>
             </w:r>
           </w:p>
         </w:tc>
@@ -4519,7 +4676,7 @@
           <w:sz w:val="22"/>
           <w:szCs w:val="22"/>
         </w:rPr>
-        <w:t xml:space="preserve">GPIO 26 bis 37 sind beim S3FH4R2 durch Flash/PSRAM belegt. Nicht benutzen.</w:t>
+        <w:t xml:space="preserve">Header-Reihen (Draufsicht, USB-C oben): links 5V, GND, 3V3, IO1 bis IO6; rechts IO43 (TX), IO44 (RX), IO13 bis IO7.</w:t>
       </w:r>
     </w:p>
     <w:p>
@@ -4537,7 +4694,7 @@
           <w:sz w:val="22"/>
           <w:szCs w:val="22"/>
         </w:rPr>
-        <w:t xml:space="preserve">GPIO 0, 3, 45 und 46 sind Strapping-Pins (Startverhalten). Sie bleiben frei.</w:t>
+        <w:t xml:space="preserve">GPIO 26 bis 37 sind beim S3FH4R2 durch Flash/PSRAM belegt. Nicht benutzen.</w:t>
       </w:r>
     </w:p>
     <w:p>
@@ -4555,7 +4712,7 @@
           <w:sz w:val="22"/>
           <w:szCs w:val="22"/>
         </w:rPr>
-        <w:t xml:space="preserve">GPIO 19 und 20 sind der USB-Anschluss (Flashen und Konsole).</w:t>
+        <w:t xml:space="preserve">GPIO 0, 45 und 46 sind Strapping-Pins und bleiben frei. GPIO 3 (BCLK) ist nur für die JTAG-Auswahl per eFuse ein Strapping-Pin und hier unkritisch.</w:t>
       </w:r>
     </w:p>
     <w:p>
@@ -4573,7 +4730,7 @@
           <w:sz w:val="22"/>
           <w:szCs w:val="22"/>
         </w:rPr>
-        <w:t xml:space="preserve">GPIO 21 ist die RGB-LED auf dem S3-Zero.</w:t>
+        <w:t xml:space="preserve">GPIO 19 und 20 sind der USB-Anschluss (Flashen und Konsole). Deshalb ist UART0 auf IO43/IO44 frei für das GPS. Beim Einschalten gibt der S3 kurz ein Startprotokoll auf IO43 aus; das GPS ignoriert es.</w:t>
       </w:r>
     </w:p>
     <w:p>
@@ -4591,7 +4748,7 @@
           <w:sz w:val="22"/>
           <w:szCs w:val="22"/>
         </w:rPr>
-        <w:t xml:space="preserve">Der S3 hat drei Hardware-UARTs: Port A, B und C laufen alle in Hardware.</w:t>
+        <w:t xml:space="preserve">GPIO 21 ist die RGB-LED auf dem S3-Zero. Die Lötpads 14 bis 16 auf der Unterseite bleiben frei.</w:t>
       </w:r>
     </w:p>
     <w:p>
@@ -4706,24 +4863,19 @@
     </w:p>
     <w:p>
       <w:pPr>
-        <w:pStyle w:val="Heading2"/>
-        <w:spacing w:after="120" w:before="200"/>
-      </w:pPr>
-      <w:r>
-        <w:rPr>
-          <w:rFonts w:ascii="Arial" w:cs="Arial" w:eastAsia="Arial" w:hAnsi="Arial"/>
-        </w:rPr>
-        <w:t xml:space="preserve">Verstärker MAX98357A</w:t>
-      </w:r>
-    </w:p>
-    <w:p>
-      <w:pPr>
-        <w:pStyle w:val="ListParagraph"/>
-        <w:numPr>
-          <w:ilvl w:val="0"/>
-          <w:numId w:val="2"/>
-        </w:numPr>
-        <w:spacing w:after="80"/>
+        <w:pStyle w:val="Heading1"/>
+        <w:spacing w:after="160" w:before="300"/>
+      </w:pPr>
+      <w:r>
+        <w:rPr>
+          <w:rFonts w:ascii="Arial" w:cs="Arial" w:eastAsia="Arial" w:hAnsi="Arial"/>
+        </w:rPr>
+        <w:t xml:space="preserve">5. Verstärker direkt auf dem ESP</w:t>
+      </w:r>
+    </w:p>
+    <w:p>
+      <w:pPr>
+        <w:spacing w:after="120"/>
       </w:pPr>
       <w:r>
         <w:rPr>
@@ -4731,68 +4883,7 @@
           <w:sz w:val="22"/>
           <w:szCs w:val="22"/>
         </w:rPr>
-        <w:t xml:space="preserve">GAIN offen lassen ergibt 9 dB. Lauter: GAIN an GND (12 dB). Leiser: GAIN an VIN (6 dB).</w:t>
-      </w:r>
-    </w:p>
-    <w:p>
-      <w:pPr>
-        <w:pStyle w:val="ListParagraph"/>
-        <w:numPr>
-          <w:ilvl w:val="0"/>
-          <w:numId w:val="2"/>
-        </w:numPr>
-        <w:spacing w:after="80"/>
-      </w:pPr>
-      <w:r>
-        <w:rPr>
-          <w:rFonts w:ascii="Arial" w:cs="Arial" w:eastAsia="Arial" w:hAnsi="Arial"/>
-          <w:sz w:val="22"/>
-          <w:szCs w:val="22"/>
-        </w:rPr>
-        <w:t xml:space="preserve">SD-Pin des Breakouts offen lassen: Der Verstärker gibt dann das Mono-Signal aus. SD an GND schaltet ihn stumm.</w:t>
-      </w:r>
-    </w:p>
-    <w:p>
-      <w:pPr>
-        <w:pStyle w:val="ListParagraph"/>
-        <w:numPr>
-          <w:ilvl w:val="0"/>
-          <w:numId w:val="2"/>
-        </w:numPr>
-        <w:spacing w:after="80"/>
-      </w:pPr>
-      <w:r>
-        <w:rPr>
-          <w:rFonts w:ascii="Arial" w:cs="Arial" w:eastAsia="Arial" w:hAnsi="Arial"/>
-          <w:sz w:val="22"/>
-          <w:szCs w:val="22"/>
-        </w:rPr>
-        <w:t xml:space="preserve">Der Lautsprecher kommt nur an + und − des Verstärkers, nie an GND.</w:t>
-      </w:r>
-    </w:p>
-    <w:p>
-      <w:pPr>
-        <w:pStyle w:val="Heading1"/>
-        <w:spacing w:after="160" w:before="300"/>
-      </w:pPr>
-      <w:r>
-        <w:rPr>
-          <w:rFonts w:ascii="Arial" w:cs="Arial" w:eastAsia="Arial" w:hAnsi="Arial"/>
-        </w:rPr>
-        <w:t xml:space="preserve">5. Steckerbelegung</w:t>
-      </w:r>
-    </w:p>
-    <w:p>
-      <w:pPr>
-        <w:spacing w:after="120"/>
-      </w:pPr>
-      <w:r>
-        <w:rPr>
-          <w:rFonts w:ascii="Arial" w:cs="Arial" w:eastAsia="Arial" w:hAnsi="Arial"/>
-          <w:sz w:val="22"/>
-          <w:szCs w:val="22"/>
-        </w:rPr>
-        <w:t xml:space="preserve">Die Reihenfolge ist ein Vorschlag. Wichtig ist nur, dass TX des Geräts an RX des ESP geht und umgekehrt.</w:t>
+        <w:t xml:space="preserve">Der MAX98357A wird ohne Kabel direkt auf die Versorgungsreihe des Waveshare ESP32-S3-Zero gelötet. Die 7 Pins des MAX (LRC, BCLK, DIN, GAIN, SD, GND, VIN) treffen dabei in umgekehrter Reihenfolge genau auf 5V, GND, 3V3, IO1, IO2, IO3, IO4. VIN muss auf 5V liegen, GND auf GND.</w:t>
       </w:r>
     </w:p>
     <w:p>
@@ -4803,9 +4894,9 @@
       <w:r>
         <w:drawing>
           <wp:inline distT="0" distB="0" distL="0" distR="0">
-            <wp:extent cx="5905500" cy="2362200"/>
+            <wp:extent cx="5334000" cy="3286125"/>
             <wp:effectExtent t="0" r="0" b="0" l="0"/>
-            <wp:docPr id="1" name="stecker_S3.png" descr="Bild 3: Steckerbelegung Port A, B und C" title="Bild 3: Steckerbelegung Port A, B und C"/>
+            <wp:docPr id="1" name="max_direkt_S3.png" descr="Bild 3: MAX98357A direkt auf dem Waveshare ESP32-S3-Zero" title="Bild 3: MAX98357A direkt auf dem Waveshare ESP32-S3-Zero"/>
             <wp:cNvGraphicFramePr>
               <a:graphicFrameLocks xmlns:a="http://schemas.openxmlformats.org/drawingml/2006/main" noChangeAspect="1"/>
             </wp:cNvGraphicFramePr>
@@ -4828,7 +4919,7 @@
                   <pic:spPr bwMode="auto">
                     <a:xfrm>
                       <a:off x="0" y="0"/>
-                      <a:ext cx="5905500" cy="2362200"/>
+                      <a:ext cx="5334000" cy="3286125"/>
                     </a:xfrm>
                     <a:prstGeom prst="rect">
                       <a:avLst/>
@@ -4855,7 +4946,79 @@
           <w:sz w:val="18"/>
           <w:szCs w:val="18"/>
         </w:rPr>
-        <w:t xml:space="preserve">Bild 3: Steckerbelegung Port A, B und C</w:t>
+        <w:t xml:space="preserve">Bild 3: MAX98357A direkt auf dem Waveshare ESP32-S3-Zero</w:t>
+      </w:r>
+    </w:p>
+    <w:p>
+      <w:pPr>
+        <w:pStyle w:val="ListParagraph"/>
+        <w:numPr>
+          <w:ilvl w:val="0"/>
+          <w:numId w:val="2"/>
+        </w:numPr>
+        <w:spacing w:after="80"/>
+      </w:pPr>
+      <w:r>
+        <w:rPr>
+          <w:rFonts w:ascii="Arial" w:cs="Arial" w:eastAsia="Arial" w:hAnsi="Arial"/>
+          <w:sz w:val="22"/>
+          <w:szCs w:val="22"/>
+        </w:rPr>
+        <w:t xml:space="preserve">SD liegt auf 3V3: Der Verstärker ist immer eingeschaltet und gibt den linken Kanal aus. Die Firmware schreibt das Mono-Signal auf beide Kanäle, es fehlt also nichts.</w:t>
+      </w:r>
+    </w:p>
+    <w:p>
+      <w:pPr>
+        <w:pStyle w:val="ListParagraph"/>
+        <w:numPr>
+          <w:ilvl w:val="0"/>
+          <w:numId w:val="2"/>
+        </w:numPr>
+        <w:spacing w:after="80"/>
+      </w:pPr>
+      <w:r>
+        <w:rPr>
+          <w:rFonts w:ascii="Arial" w:cs="Arial" w:eastAsia="Arial" w:hAnsi="Arial"/>
+          <w:sz w:val="22"/>
+          <w:szCs w:val="22"/>
+        </w:rPr>
+        <w:t xml:space="preserve">GAIN liegt auf GPIO1. Die Firmware lässt den Pin offen (Eingang ohne Pull-up), das ergibt 9 dB. Später kann sie die Lautstärkestufe umschalten: LOW = 12 dB, HIGH = 6 dB.</w:t>
+      </w:r>
+    </w:p>
+    <w:p>
+      <w:pPr>
+        <w:pStyle w:val="ListParagraph"/>
+        <w:numPr>
+          <w:ilvl w:val="0"/>
+          <w:numId w:val="2"/>
+        </w:numPr>
+        <w:spacing w:after="80"/>
+      </w:pPr>
+      <w:r>
+        <w:rPr>
+          <w:rFonts w:ascii="Arial" w:cs="Arial" w:eastAsia="Arial" w:hAnsi="Arial"/>
+          <w:sz w:val="22"/>
+          <w:szCs w:val="22"/>
+        </w:rPr>
+        <w:t xml:space="preserve">Der Lautsprecher kommt nur an + und − des Verstärkers, nie an GND.</w:t>
+      </w:r>
+    </w:p>
+    <w:p>
+      <w:pPr>
+        <w:pStyle w:val="ListParagraph"/>
+        <w:numPr>
+          <w:ilvl w:val="0"/>
+          <w:numId w:val="2"/>
+        </w:numPr>
+        <w:spacing w:after="80"/>
+      </w:pPr>
+      <w:r>
+        <w:rPr>
+          <w:rFonts w:ascii="Arial" w:cs="Arial" w:eastAsia="Arial" w:hAnsi="Arial"/>
+          <w:sz w:val="22"/>
+          <w:szCs w:val="22"/>
+        </w:rPr>
+        <w:t xml:space="preserve">Die übrigen Geräte (Port A, B, C) holen +5V und GND an denselben Lötstellen ab. Am einfachsten über die VIN- und GND-Pins des MAX.</w:t>
       </w:r>
     </w:p>
     <w:p>
@@ -4867,7 +5030,7 @@
         <w:rPr>
           <w:rFonts w:ascii="Arial" w:cs="Arial" w:eastAsia="Arial" w:hAnsi="Arial"/>
         </w:rPr>
-        <w:t xml:space="preserve">6. Port B als S.Port (LiPo-Sensor)</w:t>
+        <w:t xml:space="preserve">6. Steckerbelegung</w:t>
       </w:r>
     </w:p>
     <w:p>
@@ -4880,7 +5043,7 @@
           <w:sz w:val="22"/>
           <w:szCs w:val="22"/>
         </w:rPr>
-        <w:t xml:space="preserve">Der FrSky-S.Port ist eine Eindrahtleitung. Der ESP hört mit RX direkt mit und sendet mit TX über eine Diode 1N4148. Der Ring der Diode (Kathode) zeigt zur S.Port-Leitung.</w:t>
+        <w:t xml:space="preserve">Die Reihenfolge ist ein Vorschlag. Wichtig ist nur, dass TX des Geräts an RX des ESP geht und umgekehrt.</w:t>
       </w:r>
     </w:p>
     <w:p>
@@ -4891,9 +5054,9 @@
       <w:r>
         <w:drawing>
           <wp:inline distT="0" distB="0" distL="0" distR="0">
-            <wp:extent cx="5715000" cy="2000250"/>
+            <wp:extent cx="5905500" cy="2362200"/>
             <wp:effectExtent t="0" r="0" b="0" l="0"/>
-            <wp:docPr id="1" name="sport_S3.png" descr="Bild 4: S.Port-Anschluss an Port B" title="Bild 4: S.Port-Anschluss an Port B"/>
+            <wp:docPr id="1" name="stecker_S3.png" descr="Bild 4: Steckerbelegung Port A, B und C" title="Bild 4: Steckerbelegung Port A, B und C"/>
             <wp:cNvGraphicFramePr>
               <a:graphicFrameLocks xmlns:a="http://schemas.openxmlformats.org/drawingml/2006/main" noChangeAspect="1"/>
             </wp:cNvGraphicFramePr>
@@ -4916,7 +5079,7 @@
                   <pic:spPr bwMode="auto">
                     <a:xfrm>
                       <a:off x="0" y="0"/>
-                      <a:ext cx="5715000" cy="2000250"/>
+                      <a:ext cx="5905500" cy="2362200"/>
                     </a:xfrm>
                     <a:prstGeom prst="rect">
                       <a:avLst/>
@@ -4943,7 +5106,7 @@
           <w:sz w:val="18"/>
           <w:szCs w:val="18"/>
         </w:rPr>
-        <w:t xml:space="preserve">Bild 4: S.Port-Anschluss an Port B</w:t>
+        <w:t xml:space="preserve">Bild 4: Steckerbelegung Port A, B und C</w:t>
       </w:r>
     </w:p>
     <w:p>
@@ -4955,17 +5118,12 @@
         <w:rPr>
           <w:rFonts w:ascii="Arial" w:cs="Arial" w:eastAsia="Arial" w:hAnsi="Arial"/>
         </w:rPr>
-        <w:t xml:space="preserve">7. Stromversorgung</w:t>
-      </w:r>
-    </w:p>
-    <w:p>
-      <w:pPr>
-        <w:pStyle w:val="ListParagraph"/>
-        <w:numPr>
-          <w:ilvl w:val="0"/>
-          <w:numId w:val="2"/>
-        </w:numPr>
-        <w:spacing w:after="80"/>
+        <w:t xml:space="preserve">7. Port B als S.Port (LiPo-Sensor)</w:t>
+      </w:r>
+    </w:p>
+    <w:p>
+      <w:pPr>
+        <w:spacing w:after="120"/>
       </w:pPr>
       <w:r>
         <w:rPr>
@@ -4973,91 +5131,7 @@
           <w:sz w:val="22"/>
           <w:szCs w:val="22"/>
         </w:rPr>
-        <w:t xml:space="preserve">Alles läuft mit +5 V aus dem BEC des Reglers bzw. dem Empfängerstecker (Port A). Die +5-V-Leitung geht an den 5V-Pin des ESP-Boards, an VIN des Verstärkers und an die Ports B und C.</w:t>
-      </w:r>
-    </w:p>
-    <w:p>
-      <w:pPr>
-        <w:pStyle w:val="ListParagraph"/>
-        <w:numPr>
-          <w:ilvl w:val="0"/>
-          <w:numId w:val="2"/>
-        </w:numPr>
-        <w:spacing w:after="80"/>
-      </w:pPr>
-      <w:r>
-        <w:rPr>
-          <w:rFonts w:ascii="Arial" w:cs="Arial" w:eastAsia="Arial" w:hAnsi="Arial"/>
-          <w:sz w:val="22"/>
-          <w:szCs w:val="22"/>
-        </w:rPr>
-        <w:t xml:space="preserve">Strombedarf: ESP mit WLAN bis ca. 0,35 A, Verstärker bei voller Lautstärke an 4 Ω Spitzen bis ca. 0,8 A. Das BEC sollte mindestens 1,5 A liefern können.</w:t>
-      </w:r>
-    </w:p>
-    <w:p>
-      <w:pPr>
-        <w:pStyle w:val="ListParagraph"/>
-        <w:numPr>
-          <w:ilvl w:val="0"/>
-          <w:numId w:val="2"/>
-        </w:numPr>
-        <w:spacing w:after="80"/>
-      </w:pPr>
-      <w:r>
-        <w:rPr>
-          <w:rFonts w:ascii="Arial" w:cs="Arial" w:eastAsia="Arial" w:hAnsi="Arial"/>
-          <w:sz w:val="22"/>
-          <w:szCs w:val="22"/>
-        </w:rPr>
-        <w:t xml:space="preserve">Der Elko am Verstärker fängt Stromspitzen ab. Ohne ihn kann der ESP bei lauten Sounds neu starten.</w:t>
-      </w:r>
-    </w:p>
-    <w:p>
-      <w:pPr>
-        <w:pStyle w:val="ListParagraph"/>
-        <w:numPr>
-          <w:ilvl w:val="0"/>
-          <w:numId w:val="2"/>
-        </w:numPr>
-        <w:spacing w:after="80"/>
-      </w:pPr>
-      <w:r>
-        <w:rPr>
-          <w:rFonts w:ascii="Arial" w:cs="Arial" w:eastAsia="Arial" w:hAnsi="Arial"/>
-          <w:sz w:val="22"/>
-          <w:szCs w:val="22"/>
-        </w:rPr>
-        <w:t xml:space="preserve">Der 3V3-Pin ist ein Ausgang des ESP-Boards. Er versorgt nur das SD-Modul (3,3-V-Typ).</w:t>
-      </w:r>
-    </w:p>
-    <w:p>
-      <w:pPr>
-        <w:pStyle w:val="ListParagraph"/>
-        <w:numPr>
-          <w:ilvl w:val="0"/>
-          <w:numId w:val="2"/>
-        </w:numPr>
-        <w:spacing w:after="80"/>
-      </w:pPr>
-      <w:r>
-        <w:rPr>
-          <w:rFonts w:ascii="Arial" w:cs="Arial" w:eastAsia="Arial" w:hAnsi="Arial"/>
-          <w:sz w:val="22"/>
-          <w:szCs w:val="22"/>
-        </w:rPr>
-        <w:t xml:space="preserve">Beim Flashen über USB vorher den Akku bzw. das BEC abziehen, damit nicht zwei 5-V-Quellen gegeneinander arbeiten.</w:t>
-      </w:r>
-    </w:p>
-    <w:p>
-      <w:pPr>
-        <w:pStyle w:val="Heading1"/>
-        <w:spacing w:after="160" w:before="300"/>
-      </w:pPr>
-      <w:r>
-        <w:rPr>
-          <w:rFonts w:ascii="Arial" w:cs="Arial" w:eastAsia="Arial" w:hAnsi="Arial"/>
-        </w:rPr>
-        <w:t xml:space="preserve">8. Bauplan Schritt für Schritt</w:t>
+        <w:t xml:space="preserve">Der FrSky-S.Port ist eine Eindrahtleitung. Der ESP hört mit RX direkt mit und sendet mit TX über eine Diode 1N4148. Der Ring der Diode (Kathode) zeigt zur S.Port-Leitung.</w:t>
       </w:r>
     </w:p>
     <w:p>
@@ -5068,9 +5142,9 @@
       <w:r>
         <w:drawing>
           <wp:inline distT="0" distB="0" distL="0" distR="0">
-            <wp:extent cx="5715000" cy="3333750"/>
+            <wp:extent cx="5715000" cy="2000250"/>
             <wp:effectExtent t="0" r="0" b="0" l="0"/>
-            <wp:docPr id="1" name="aufbau_S3.png" descr="Bild 5: Anordnungsvorschlag auf Lochraster (Mini S3)" title="Bild 5: Anordnungsvorschlag auf Lochraster (Mini S3)"/>
+            <wp:docPr id="1" name="sport_S3.png" descr="Bild 5: S.Port-Anschluss an Port B" title="Bild 5: S.Port-Anschluss an Port B"/>
             <wp:cNvGraphicFramePr>
               <a:graphicFrameLocks xmlns:a="http://schemas.openxmlformats.org/drawingml/2006/main" noChangeAspect="1"/>
             </wp:cNvGraphicFramePr>
@@ -5093,6 +5167,183 @@
                   <pic:spPr bwMode="auto">
                     <a:xfrm>
                       <a:off x="0" y="0"/>
+                      <a:ext cx="5715000" cy="2000250"/>
+                    </a:xfrm>
+                    <a:prstGeom prst="rect">
+                      <a:avLst/>
+                    </a:prstGeom>
+                  </pic:spPr>
+                </pic:pic>
+              </a:graphicData>
+            </a:graphic>
+          </wp:inline>
+        </w:drawing>
+      </w:r>
+    </w:p>
+    <w:p>
+      <w:pPr>
+        <w:spacing w:after="200"/>
+        <w:jc w:val="center"/>
+      </w:pPr>
+      <w:r>
+        <w:rPr>
+          <w:rFonts w:ascii="Arial" w:cs="Arial" w:eastAsia="Arial" w:hAnsi="Arial"/>
+          <w:i/>
+          <w:iCs/>
+          <w:color w:val="64748B"/>
+          <w:sz w:val="18"/>
+          <w:szCs w:val="18"/>
+        </w:rPr>
+        <w:t xml:space="preserve">Bild 5: S.Port-Anschluss an Port B</w:t>
+      </w:r>
+    </w:p>
+    <w:p>
+      <w:pPr>
+        <w:pStyle w:val="Heading1"/>
+        <w:spacing w:after="160" w:before="300"/>
+      </w:pPr>
+      <w:r>
+        <w:rPr>
+          <w:rFonts w:ascii="Arial" w:cs="Arial" w:eastAsia="Arial" w:hAnsi="Arial"/>
+        </w:rPr>
+        <w:t xml:space="preserve">8. Stromversorgung</w:t>
+      </w:r>
+    </w:p>
+    <w:p>
+      <w:pPr>
+        <w:pStyle w:val="ListParagraph"/>
+        <w:numPr>
+          <w:ilvl w:val="0"/>
+          <w:numId w:val="2"/>
+        </w:numPr>
+        <w:spacing w:after="80"/>
+      </w:pPr>
+      <w:r>
+        <w:rPr>
+          <w:rFonts w:ascii="Arial" w:cs="Arial" w:eastAsia="Arial" w:hAnsi="Arial"/>
+          <w:sz w:val="22"/>
+          <w:szCs w:val="22"/>
+        </w:rPr>
+        <w:t xml:space="preserve">Alles läuft mit +5 V aus dem BEC des Reglers bzw. dem Empfängerstecker (Port A). Die +5-V-Leitung geht an den 5V-Pin des ESP-Boards (dort sitzt auch VIN des MAX) und an die Ports B und C.</w:t>
+      </w:r>
+    </w:p>
+    <w:p>
+      <w:pPr>
+        <w:pStyle w:val="ListParagraph"/>
+        <w:numPr>
+          <w:ilvl w:val="0"/>
+          <w:numId w:val="2"/>
+        </w:numPr>
+        <w:spacing w:after="80"/>
+      </w:pPr>
+      <w:r>
+        <w:rPr>
+          <w:rFonts w:ascii="Arial" w:cs="Arial" w:eastAsia="Arial" w:hAnsi="Arial"/>
+          <w:sz w:val="22"/>
+          <w:szCs w:val="22"/>
+        </w:rPr>
+        <w:t xml:space="preserve">Strombedarf: ESP mit WLAN bis ca. 0,35 A, Verstärker bei voller Lautstärke an 4 Ω Spitzen bis ca. 0,8 A. Das BEC sollte mindestens 1,5 A liefern können.</w:t>
+      </w:r>
+    </w:p>
+    <w:p>
+      <w:pPr>
+        <w:pStyle w:val="ListParagraph"/>
+        <w:numPr>
+          <w:ilvl w:val="0"/>
+          <w:numId w:val="2"/>
+        </w:numPr>
+        <w:spacing w:after="80"/>
+      </w:pPr>
+      <w:r>
+        <w:rPr>
+          <w:rFonts w:ascii="Arial" w:cs="Arial" w:eastAsia="Arial" w:hAnsi="Arial"/>
+          <w:sz w:val="22"/>
+          <w:szCs w:val="22"/>
+        </w:rPr>
+        <w:t xml:space="preserve">Der Elko am Verstärker fängt Stromspitzen ab. Ohne ihn kann der ESP bei lauten Sounds neu starten.</w:t>
+      </w:r>
+    </w:p>
+    <w:p>
+      <w:pPr>
+        <w:pStyle w:val="ListParagraph"/>
+        <w:numPr>
+          <w:ilvl w:val="0"/>
+          <w:numId w:val="2"/>
+        </w:numPr>
+        <w:spacing w:after="80"/>
+      </w:pPr>
+      <w:r>
+        <w:rPr>
+          <w:rFonts w:ascii="Arial" w:cs="Arial" w:eastAsia="Arial" w:hAnsi="Arial"/>
+          <w:sz w:val="22"/>
+          <w:szCs w:val="22"/>
+        </w:rPr>
+        <w:t xml:space="preserve">Der 3V3-Pin ist ein Ausgang des ESP-Boards. Er versorgt nur das SD-Modul (3,3-V-Typ).</w:t>
+      </w:r>
+    </w:p>
+    <w:p>
+      <w:pPr>
+        <w:pStyle w:val="ListParagraph"/>
+        <w:numPr>
+          <w:ilvl w:val="0"/>
+          <w:numId w:val="2"/>
+        </w:numPr>
+        <w:spacing w:after="80"/>
+      </w:pPr>
+      <w:r>
+        <w:rPr>
+          <w:rFonts w:ascii="Arial" w:cs="Arial" w:eastAsia="Arial" w:hAnsi="Arial"/>
+          <w:sz w:val="22"/>
+          <w:szCs w:val="22"/>
+        </w:rPr>
+        <w:t xml:space="preserve">Beim Flashen über USB vorher den Akku bzw. das BEC abziehen, damit nicht zwei 5-V-Quellen gegeneinander arbeiten.</w:t>
+      </w:r>
+    </w:p>
+    <w:p>
+      <w:pPr>
+        <w:pStyle w:val="Heading1"/>
+        <w:spacing w:after="160" w:before="300"/>
+      </w:pPr>
+      <w:r>
+        <w:rPr>
+          <w:rFonts w:ascii="Arial" w:cs="Arial" w:eastAsia="Arial" w:hAnsi="Arial"/>
+        </w:rPr>
+        <w:t xml:space="preserve">9. Bauplan Schritt für Schritt</w:t>
+      </w:r>
+    </w:p>
+    <w:p>
+      <w:pPr>
+        <w:spacing w:after="60" w:before="120"/>
+        <w:jc w:val="center"/>
+      </w:pPr>
+      <w:r>
+        <w:drawing>
+          <wp:inline distT="0" distB="0" distL="0" distR="0">
+            <wp:extent cx="5715000" cy="3333750"/>
+            <wp:effectExtent t="0" r="0" b="0" l="0"/>
+            <wp:docPr id="1" name="aufbau_S3.png" descr="Bild 6: Anordnungsvorschlag auf Lochraster (Mini S3)" title="Bild 6: Anordnungsvorschlag auf Lochraster (Mini S3)"/>
+            <wp:cNvGraphicFramePr>
+              <a:graphicFrameLocks xmlns:a="http://schemas.openxmlformats.org/drawingml/2006/main" noChangeAspect="1"/>
+            </wp:cNvGraphicFramePr>
+            <a:graphic xmlns:a="http://schemas.openxmlformats.org/drawingml/2006/main">
+              <a:graphicData uri="http://schemas.openxmlformats.org/drawingml/2006/picture">
+                <pic:pic xmlns:pic="http://schemas.openxmlformats.org/drawingml/2006/picture">
+                  <pic:nvPicPr>
+                    <pic:cNvPr id="0" name="" descr=""/>
+                    <pic:cNvPicPr>
+                      <a:picLocks noChangeAspect="1" noChangeArrowheads="1"/>
+                    </pic:cNvPicPr>
+                  </pic:nvPicPr>
+                  <pic:blipFill>
+                    <a:blip r:embed="rId15" cstate="none"/>
+                    <a:srcRect/>
+                    <a:stretch>
+                      <a:fillRect/>
+                    </a:stretch>
+                  </pic:blipFill>
+                  <pic:spPr bwMode="auto">
+                    <a:xfrm>
+                      <a:off x="0" y="0"/>
                       <a:ext cx="5715000" cy="3333750"/>
                     </a:xfrm>
                     <a:prstGeom prst="rect">
@@ -5120,7 +5371,7 @@
           <w:sz w:val="18"/>
           <w:szCs w:val="18"/>
         </w:rPr>
-        <w:t xml:space="preserve">Bild 5: Anordnungsvorschlag auf Lochraster (Mini S3)</w:t>
+        <w:t xml:space="preserve">Bild 6: Anordnungsvorschlag auf Lochraster (Mini S3)</w:t>
       </w:r>
     </w:p>
     <w:p>
@@ -5148,7 +5399,7 @@
           <w:sz w:val="22"/>
           <w:szCs w:val="22"/>
         </w:rPr>
-        <w:t xml:space="preserve">ESP-Board per USB anschließen und die Firmware flashen (siehe Abschnitt 9). Erst wenn das Board läuft, weiterbauen.</w:t>
+        <w:t xml:space="preserve">ESP-Board per USB anschließen und die Firmware flashen (siehe Abschnitt 10). Erst wenn das Board läuft, weiterbauen.</w:t>
       </w:r>
     </w:p>
     <w:p>
@@ -5176,7 +5427,7 @@
           <w:sz w:val="22"/>
           <w:szCs w:val="22"/>
         </w:rPr>
-        <w:t xml:space="preserve">Bauteile nach Bild 5 auflegen: ESP an eine Kante (USB-C zugänglich), Verstärker direkt daneben, Stecker an die gegenüberliegende Kante.</w:t>
+        <w:t xml:space="preserve">Bauteile nach Bild 6 auflegen: ESP mit aufgelötetem MAX an eine Kante (USB-C zugänglich), Stecker an die gegenüberliegende Kante.</w:t>
       </w:r>
     </w:p>
     <w:p>
@@ -5252,7 +5503,7 @@
           <w:sz w:val="22"/>
           <w:szCs w:val="22"/>
         </w:rPr>
-        <w:t xml:space="preserve">Verstärker einbauen. </w:t>
+        <w:t xml:space="preserve">Verstärker auf den ESP löten. </w:t>
       </w:r>
       <w:r>
         <w:rPr>
@@ -5260,7 +5511,7 @@
           <w:sz w:val="22"/>
           <w:szCs w:val="22"/>
         </w:rPr>
-        <w:t xml:space="preserve">VIN an +5V, GND an Masse, Elko direkt daneben (Minus an GND). Dann die drei I2S-Leitungen: GPIO7 an BCLK, GPIO8 an LRC, GPIO9 an DIN. Leitungen kurz halten.</w:t>
+        <w:t xml:space="preserve">Den MAX98357A mit seiner 7-poligen Stiftleiste so auf die Versorgungsreihe setzen, dass VIN auf 5V und LRC auf IO4 liegt (Bild 3). Vor dem Löten mit dem Multimeter prüfen: VIN–5V und GND–GND. Den Elko (220 µF) direkt an VIN/GND des MAX löten, Minus an GND.</w:t>
       </w:r>
     </w:p>
     <w:p>
@@ -5316,7 +5567,7 @@
           <w:sz w:val="22"/>
           <w:szCs w:val="22"/>
         </w:rPr>
-        <w:t xml:space="preserve">Stecker nach Bild 3: GND, +5V, ESP-RX, ESP-TX.</w:t>
+        <w:t xml:space="preserve">Stecker nach Bild 4: GND, +5V, ESP-RX, ESP-TX.</w:t>
       </w:r>
     </w:p>
     <w:p>
@@ -5344,7 +5595,7 @@
           <w:sz w:val="22"/>
           <w:szCs w:val="22"/>
         </w:rPr>
-        <w:t xml:space="preserve">Gleiches Schema wie Port A. Für S.Port die Diode nach Bild 4 einsetzen.</w:t>
+        <w:t xml:space="preserve">Gleiches Schema wie Port A. Für S.Port die Diode nach Bild 5 einsetzen.</w:t>
       </w:r>
     </w:p>
     <w:p>
@@ -5400,7 +5651,7 @@
           <w:sz w:val="22"/>
           <w:szCs w:val="22"/>
         </w:rPr>
-        <w:t xml:space="preserve">Zwei Pins: GPIO4 und GND. Jumper gesteckt beim Einschalten = WLAN geht an.</w:t>
+        <w:t xml:space="preserve">Zwei Pins: GPIO9 und GND. Jumper gesteckt beim Einschalten = WLAN geht an.</w:t>
       </w:r>
     </w:p>
     <w:p>
@@ -5468,7 +5719,7 @@
         <w:rPr>
           <w:rFonts w:ascii="Arial" w:cs="Arial" w:eastAsia="Arial" w:hAnsi="Arial"/>
         </w:rPr>
-        <w:t xml:space="preserve">9. Inbetriebnahme</w:t>
+        <w:t xml:space="preserve">10. Inbetriebnahme</w:t>
       </w:r>
     </w:p>
     <w:p>
@@ -5583,7 +5834,7 @@
         <w:rPr>
           <w:rFonts w:ascii="Arial" w:cs="Arial" w:eastAsia="Arial" w:hAnsi="Arial"/>
         </w:rPr>
-        <w:t xml:space="preserve">10. Offene Punkte</w:t>
+        <w:t xml:space="preserve">11. Offene Punkte</w:t>
       </w:r>
     </w:p>
     <w:p>

</xml_diff>

<commit_message>
Bauplan vereinfacht: ohne Elko, ohne SD-Karte, SD-Pin des MAX offen
3V3 des ESP bleibt frei (SD-Pin des MAX nicht geloetet, das Breakout
schaltet den Verstaerker selbst ein). Port B und Port C nur noch als
RX/TX beschrieben, S.Port-Bild entfernt.

Co-Authored-By: Claude Opus 5.5 (1M context) <noreply@anthropic.com>
Claude-Session: https://claude.ai/code/session_01Ty5RYkDwYVKc2svXrgQ3BJ
</commit_message>
<xml_diff>
--- a/docs/Hardware-Bauplan_Mini-S3.docx
+++ b/docs/Hardware-Bauplan_Mini-S3.docx
@@ -101,7 +101,7 @@
                 <w:sz w:val="21"/>
                 <w:szCs w:val="21"/>
               </w:rPr>
-              <w:t xml:space="preserve">Die Pinbelegung steht in der Firmware (firmware/src/pins.h) und ist so gewählt, dass der MAX98357A direkt auf der Versorgungsreihe des S3-Zero sitzt. Die Reihenfolge der Header-Pins stammt aus dem Footprint im Repo RC-Multiswitch-ESP32-S3 (laut Waveshare-Pinout). Einen KiCad-Schaltplan für das Mini gibt es noch nicht; die Grafiken sind aus pins.h gezeichnet.</w:t>
+              <w:t xml:space="preserve">Die Pinbelegung steht in der Firmware (firmware/src/pins.h) und ist so gewählt, dass der MAX98357A direkt auf der Versorgungsreihe des S3-Zero sitzt. Die Reihenfolge der Header-Pins stammt aus dem Footprint im Repo RC-Multiswitch-ESP32-S3 (laut Waveshare-Pinout). Einen KiCad-Schaltplan für das Mini gibt es noch nicht; die Grafiken sind aus pins.h gezeichnet. Die SD-Karte ist in diesem Aufbau nicht vorgesehen, die Sounds liegen im Flash.</w:t>
             </w:r>
           </w:p>
         </w:tc>
@@ -142,7 +142,7 @@
           <w:sz w:val="22"/>
           <w:szCs w:val="22"/>
         </w:rPr>
-        <w:t xml:space="preserve">Das Soundmodul Mini spielt Motorgeräusche (Start, Lauf, Stopp) und vier Zusatzsounds. Es hängt am CRSF-Bus des Empfängers (ExpressLRS oder Crossfire) und wird über das Lua-Menü am Sender oder per WLAN-Weboberfläche eingestellt. Die Sounds liegen im Flash des ESP32, optional auf einer microSD-Karte. Ein MAX98357A-Verstärker treibt den Lautsprecher direkt.</w:t>
+        <w:t xml:space="preserve">Das Soundmodul Mini spielt Motorgeräusche (Start, Lauf, Stopp) und vier Zusatzsounds. Es hängt am CRSF-Bus des Empfängers (ExpressLRS oder Crossfire) und wird über das Lua-Menü am Sender oder per WLAN-Weboberfläche eingestellt. Die Sounds liegen im Flash des ESP32. Ein MAX98357A-Verstärker treibt den Lautsprecher direkt.</w:t>
       </w:r>
     </w:p>
     <w:p>
@@ -155,7 +155,7 @@
           <w:sz w:val="22"/>
           <w:szCs w:val="22"/>
         </w:rPr>
-        <w:t xml:space="preserve">Zusätzlich gibt es zwei Ports für Telemetrie: Port B für einen FrSky-LiPo-Sensor (S.Port) oder ein zweites CRSF-Gerät und Port C für ein GPS-Modul (Geschwindigkeit als Telemetrie).</w:t>
+        <w:t xml:space="preserve">Zusätzlich gibt es zwei serielle Anschlüsse, Port B und Port C, jeweils mit RX und TX. Wofür sie genutzt werden, wird später festgelegt.</w:t>
       </w:r>
     </w:p>
     <w:p>
@@ -691,7 +691,7 @@
                 <w:sz w:val="19"/>
                 <w:szCs w:val="19"/>
               </w:rPr>
-              <w:t xml:space="preserve">Elko 220 µF / 10 V (100–470 µF)</w:t>
+              <w:t xml:space="preserve">Stiftleiste 4-polig (oder JST-Buchse)</w:t>
             </w:r>
           </w:p>
         </w:tc>
@@ -722,7 +722,7 @@
                 <w:sz w:val="19"/>
                 <w:szCs w:val="19"/>
               </w:rPr>
-              <w:t xml:space="preserve">direkt an VIN/GND des Verstärkers</w:t>
+              <w:t xml:space="preserve">Port A (Empfänger)</w:t>
             </w:r>
           </w:p>
         </w:tc>
@@ -754,7 +754,7 @@
                 <w:sz w:val="19"/>
                 <w:szCs w:val="19"/>
               </w:rPr>
-              <w:t xml:space="preserve">1</w:t>
+              <w:t xml:space="preserve">2</w:t>
             </w:r>
           </w:p>
         </w:tc>
@@ -784,7 +784,7 @@
                 <w:sz w:val="19"/>
                 <w:szCs w:val="19"/>
               </w:rPr>
-              <w:t xml:space="preserve">microSD-Modul (SPI), optional</w:t>
+              <w:t xml:space="preserve">Stiftleiste 2-polig</w:t>
             </w:r>
           </w:p>
         </w:tc>
@@ -814,7 +814,7 @@
                 <w:sz w:val="19"/>
                 <w:szCs w:val="19"/>
               </w:rPr>
-              <w:t xml:space="preserve">3,3-V-Typ an 3V3 oder 5-V-Typ mit Regler an +5V</w:t>
+              <w:t xml:space="preserve">Port B und Port C (RX, TX)</w:t>
             </w:r>
           </w:p>
         </w:tc>
@@ -847,7 +847,7 @@
                 <w:sz w:val="19"/>
                 <w:szCs w:val="19"/>
               </w:rPr>
-              <w:t xml:space="preserve">3</w:t>
+              <w:t xml:space="preserve">1</w:t>
             </w:r>
           </w:p>
         </w:tc>
@@ -878,7 +878,7 @@
                 <w:sz w:val="19"/>
                 <w:szCs w:val="19"/>
               </w:rPr>
-              <w:t xml:space="preserve">Stiftleiste 4-polig (oder JST-Buchse)</w:t>
+              <w:t xml:space="preserve">Stiftleiste 7-polig</w:t>
             </w:r>
           </w:p>
         </w:tc>
@@ -909,7 +909,7 @@
                 <w:sz w:val="19"/>
                 <w:szCs w:val="19"/>
               </w:rPr>
-              <w:t xml:space="preserve">Port A, B, C</w:t>
+              <w:t xml:space="preserve">MAX98357A auf den ESP (liegt dem MAX meist bei)</w:t>
             </w:r>
           </w:p>
         </w:tc>
@@ -1128,7 +1128,7 @@
                 <w:sz w:val="19"/>
                 <w:szCs w:val="19"/>
               </w:rPr>
-              <w:t xml:space="preserve">1</w:t>
+              <w:t xml:space="preserve">2</w:t>
             </w:r>
           </w:p>
         </w:tc>
@@ -1158,7 +1158,7 @@
                 <w:sz w:val="19"/>
                 <w:szCs w:val="19"/>
               </w:rPr>
-              <w:t xml:space="preserve">1N4148</w:t>
+              <w:t xml:space="preserve">Buchsenleiste passend zum ESP-Board</w:t>
             </w:r>
           </w:p>
         </w:tc>
@@ -1188,7 +1188,7 @@
                 <w:sz w:val="19"/>
                 <w:szCs w:val="19"/>
               </w:rPr>
-              <w:t xml:space="preserve">nur für S.Port an Port B</w:t>
+              <w:t xml:space="preserve">ESP steckbar statt fest gelötet</w:t>
             </w:r>
           </w:p>
         </w:tc>
@@ -1221,7 +1221,7 @@
                 <w:sz w:val="19"/>
                 <w:szCs w:val="19"/>
               </w:rPr>
-              <w:t xml:space="preserve">2</w:t>
+              <w:t xml:space="preserve">1</w:t>
             </w:r>
           </w:p>
         </w:tc>
@@ -1252,7 +1252,7 @@
                 <w:sz w:val="19"/>
                 <w:szCs w:val="19"/>
               </w:rPr>
-              <w:t xml:space="preserve">Buchsenleiste passend zum ESP-Board</w:t>
+              <w:t xml:space="preserve">Lochrasterplatine ca. 5 × 7 cm</w:t>
             </w:r>
           </w:p>
         </w:tc>
@@ -1283,7 +1283,7 @@
                 <w:sz w:val="19"/>
                 <w:szCs w:val="19"/>
               </w:rPr>
-              <w:t xml:space="preserve">ESP steckbar statt fest gelötet</w:t>
+              <w:t xml:space="preserve">oder eigene Platine</w:t>
             </w:r>
           </w:p>
         </w:tc>
@@ -1315,7 +1315,7 @@
                 <w:sz w:val="19"/>
                 <w:szCs w:val="19"/>
               </w:rPr>
-              <w:t xml:space="preserve">1</w:t>
+              <w:t xml:space="preserve">–</w:t>
             </w:r>
           </w:p>
         </w:tc>
@@ -1345,7 +1345,7 @@
                 <w:sz w:val="19"/>
                 <w:szCs w:val="19"/>
               </w:rPr>
-              <w:t xml:space="preserve">Lochrasterplatine ca. 5 × 7 cm</w:t>
+              <w:t xml:space="preserve">Litze, Schrumpfschlauch</w:t>
             </w:r>
           </w:p>
         </w:tc>
@@ -1375,289 +1375,7 @@
                 <w:sz w:val="19"/>
                 <w:szCs w:val="19"/>
               </w:rPr>
-              <w:t xml:space="preserve">oder eigene Platine</w:t>
-            </w:r>
-          </w:p>
-        </w:tc>
-      </w:tr>
-      <w:tr>
-        <w:tc>
-          <w:tcPr>
-            <w:tcW w:type="dxa" w:w="900"/>
-            <w:tcBorders>
-              <w:top w:val="single" w:color="CBD5E1" w:sz="4"/>
-              <w:left w:val="single" w:color="CBD5E1" w:sz="4"/>
-              <w:bottom w:val="single" w:color="CBD5E1" w:sz="4"/>
-              <w:right w:val="single" w:color="CBD5E1" w:sz="4"/>
-            </w:tcBorders>
-            <w:shd w:fill="F1F5F9" w:color="auto" w:val="clear"/>
-            <w:tcMar>
-              <w:top w:type="dxa" w:w="60"/>
-              <w:left w:type="dxa" w:w="100"/>
-              <w:bottom w:type="dxa" w:w="60"/>
-              <w:right w:type="dxa" w:w="100"/>
-            </w:tcMar>
-          </w:tcPr>
-          <w:p>
-            <w:r>
-              <w:rPr>
-                <w:rFonts w:ascii="Arial" w:cs="Arial" w:eastAsia="Arial" w:hAnsi="Arial"/>
-                <w:b w:val="false"/>
-                <w:bCs w:val="false"/>
-                <w:color w:val="0F172A"/>
-                <w:sz w:val="19"/>
-                <w:szCs w:val="19"/>
-              </w:rPr>
-              <w:t xml:space="preserve">–</w:t>
-            </w:r>
-          </w:p>
-        </w:tc>
-        <w:tc>
-          <w:tcPr>
-            <w:tcW w:type="dxa" w:w="3900"/>
-            <w:tcBorders>
-              <w:top w:val="single" w:color="CBD5E1" w:sz="4"/>
-              <w:left w:val="single" w:color="CBD5E1" w:sz="4"/>
-              <w:bottom w:val="single" w:color="CBD5E1" w:sz="4"/>
-              <w:right w:val="single" w:color="CBD5E1" w:sz="4"/>
-            </w:tcBorders>
-            <w:shd w:fill="F1F5F9" w:color="auto" w:val="clear"/>
-            <w:tcMar>
-              <w:top w:type="dxa" w:w="60"/>
-              <w:left w:type="dxa" w:w="100"/>
-              <w:bottom w:type="dxa" w:w="60"/>
-              <w:right w:type="dxa" w:w="100"/>
-            </w:tcMar>
-          </w:tcPr>
-          <w:p>
-            <w:r>
-              <w:rPr>
-                <w:rFonts w:ascii="Arial" w:cs="Arial" w:eastAsia="Arial" w:hAnsi="Arial"/>
-                <w:b w:val="false"/>
-                <w:bCs w:val="false"/>
-                <w:color w:val="0F172A"/>
-                <w:sz w:val="19"/>
-                <w:szCs w:val="19"/>
-              </w:rPr>
-              <w:t xml:space="preserve">Litze, Schrumpfschlauch</w:t>
-            </w:r>
-          </w:p>
-        </w:tc>
-        <w:tc>
-          <w:tcPr>
-            <w:tcW w:type="dxa" w:w="4226"/>
-            <w:tcBorders>
-              <w:top w:val="single" w:color="CBD5E1" w:sz="4"/>
-              <w:left w:val="single" w:color="CBD5E1" w:sz="4"/>
-              <w:bottom w:val="single" w:color="CBD5E1" w:sz="4"/>
-              <w:right w:val="single" w:color="CBD5E1" w:sz="4"/>
-            </w:tcBorders>
-            <w:shd w:fill="F1F5F9" w:color="auto" w:val="clear"/>
-            <w:tcMar>
-              <w:top w:type="dxa" w:w="60"/>
-              <w:left w:type="dxa" w:w="100"/>
-              <w:bottom w:type="dxa" w:w="60"/>
-              <w:right w:type="dxa" w:w="100"/>
-            </w:tcMar>
-          </w:tcPr>
-          <w:p>
-            <w:r>
-              <w:rPr>
-                <w:rFonts w:ascii="Arial" w:cs="Arial" w:eastAsia="Arial" w:hAnsi="Arial"/>
-                <w:b w:val="false"/>
-                <w:bCs w:val="false"/>
-                <w:color w:val="0F172A"/>
-                <w:sz w:val="19"/>
-                <w:szCs w:val="19"/>
-              </w:rPr>
               <w:t xml:space="preserve"/>
-            </w:r>
-          </w:p>
-        </w:tc>
-      </w:tr>
-      <w:tr>
-        <w:tc>
-          <w:tcPr>
-            <w:tcW w:type="dxa" w:w="900"/>
-            <w:tcBorders>
-              <w:top w:val="single" w:color="CBD5E1" w:sz="4"/>
-              <w:left w:val="single" w:color="CBD5E1" w:sz="4"/>
-              <w:bottom w:val="single" w:color="CBD5E1" w:sz="4"/>
-              <w:right w:val="single" w:color="CBD5E1" w:sz="4"/>
-            </w:tcBorders>
-            <w:tcMar>
-              <w:top w:type="dxa" w:w="60"/>
-              <w:left w:type="dxa" w:w="100"/>
-              <w:bottom w:type="dxa" w:w="60"/>
-              <w:right w:type="dxa" w:w="100"/>
-            </w:tcMar>
-          </w:tcPr>
-          <w:p>
-            <w:r>
-              <w:rPr>
-                <w:rFonts w:ascii="Arial" w:cs="Arial" w:eastAsia="Arial" w:hAnsi="Arial"/>
-                <w:b w:val="false"/>
-                <w:bCs w:val="false"/>
-                <w:color w:val="0F172A"/>
-                <w:sz w:val="19"/>
-                <w:szCs w:val="19"/>
-              </w:rPr>
-              <w:t xml:space="preserve">opt.</w:t>
-            </w:r>
-          </w:p>
-        </w:tc>
-        <w:tc>
-          <w:tcPr>
-            <w:tcW w:type="dxa" w:w="3900"/>
-            <w:tcBorders>
-              <w:top w:val="single" w:color="CBD5E1" w:sz="4"/>
-              <w:left w:val="single" w:color="CBD5E1" w:sz="4"/>
-              <w:bottom w:val="single" w:color="CBD5E1" w:sz="4"/>
-              <w:right w:val="single" w:color="CBD5E1" w:sz="4"/>
-            </w:tcBorders>
-            <w:tcMar>
-              <w:top w:type="dxa" w:w="60"/>
-              <w:left w:type="dxa" w:w="100"/>
-              <w:bottom w:type="dxa" w:w="60"/>
-              <w:right w:type="dxa" w:w="100"/>
-            </w:tcMar>
-          </w:tcPr>
-          <w:p>
-            <w:r>
-              <w:rPr>
-                <w:rFonts w:ascii="Arial" w:cs="Arial" w:eastAsia="Arial" w:hAnsi="Arial"/>
-                <w:b w:val="false"/>
-                <w:bCs w:val="false"/>
-                <w:color w:val="0F172A"/>
-                <w:sz w:val="19"/>
-                <w:szCs w:val="19"/>
-              </w:rPr>
-              <w:t xml:space="preserve">GPS-Modul, z.B. ATGM336H</w:t>
-            </w:r>
-          </w:p>
-        </w:tc>
-        <w:tc>
-          <w:tcPr>
-            <w:tcW w:type="dxa" w:w="4226"/>
-            <w:tcBorders>
-              <w:top w:val="single" w:color="CBD5E1" w:sz="4"/>
-              <w:left w:val="single" w:color="CBD5E1" w:sz="4"/>
-              <w:bottom w:val="single" w:color="CBD5E1" w:sz="4"/>
-              <w:right w:val="single" w:color="CBD5E1" w:sz="4"/>
-            </w:tcBorders>
-            <w:tcMar>
-              <w:top w:type="dxa" w:w="60"/>
-              <w:left w:type="dxa" w:w="100"/>
-              <w:bottom w:type="dxa" w:w="60"/>
-              <w:right w:type="dxa" w:w="100"/>
-            </w:tcMar>
-          </w:tcPr>
-          <w:p>
-            <w:r>
-              <w:rPr>
-                <w:rFonts w:ascii="Arial" w:cs="Arial" w:eastAsia="Arial" w:hAnsi="Arial"/>
-                <w:b w:val="false"/>
-                <w:bCs w:val="false"/>
-                <w:color w:val="0F172A"/>
-                <w:sz w:val="19"/>
-                <w:szCs w:val="19"/>
-              </w:rPr>
-              <w:t xml:space="preserve">die Firmware sendet PCAS-Befehle (CASIC-Protokoll)</w:t>
-            </w:r>
-          </w:p>
-        </w:tc>
-      </w:tr>
-      <w:tr>
-        <w:tc>
-          <w:tcPr>
-            <w:tcW w:type="dxa" w:w="900"/>
-            <w:tcBorders>
-              <w:top w:val="single" w:color="CBD5E1" w:sz="4"/>
-              <w:left w:val="single" w:color="CBD5E1" w:sz="4"/>
-              <w:bottom w:val="single" w:color="CBD5E1" w:sz="4"/>
-              <w:right w:val="single" w:color="CBD5E1" w:sz="4"/>
-            </w:tcBorders>
-            <w:shd w:fill="F1F5F9" w:color="auto" w:val="clear"/>
-            <w:tcMar>
-              <w:top w:type="dxa" w:w="60"/>
-              <w:left w:type="dxa" w:w="100"/>
-              <w:bottom w:type="dxa" w:w="60"/>
-              <w:right w:type="dxa" w:w="100"/>
-            </w:tcMar>
-          </w:tcPr>
-          <w:p>
-            <w:r>
-              <w:rPr>
-                <w:rFonts w:ascii="Arial" w:cs="Arial" w:eastAsia="Arial" w:hAnsi="Arial"/>
-                <w:b w:val="false"/>
-                <w:bCs w:val="false"/>
-                <w:color w:val="0F172A"/>
-                <w:sz w:val="19"/>
-                <w:szCs w:val="19"/>
-              </w:rPr>
-              <w:t xml:space="preserve">opt.</w:t>
-            </w:r>
-          </w:p>
-        </w:tc>
-        <w:tc>
-          <w:tcPr>
-            <w:tcW w:type="dxa" w:w="3900"/>
-            <w:tcBorders>
-              <w:top w:val="single" w:color="CBD5E1" w:sz="4"/>
-              <w:left w:val="single" w:color="CBD5E1" w:sz="4"/>
-              <w:bottom w:val="single" w:color="CBD5E1" w:sz="4"/>
-              <w:right w:val="single" w:color="CBD5E1" w:sz="4"/>
-            </w:tcBorders>
-            <w:shd w:fill="F1F5F9" w:color="auto" w:val="clear"/>
-            <w:tcMar>
-              <w:top w:type="dxa" w:w="60"/>
-              <w:left w:type="dxa" w:w="100"/>
-              <w:bottom w:type="dxa" w:w="60"/>
-              <w:right w:type="dxa" w:w="100"/>
-            </w:tcMar>
-          </w:tcPr>
-          <w:p>
-            <w:r>
-              <w:rPr>
-                <w:rFonts w:ascii="Arial" w:cs="Arial" w:eastAsia="Arial" w:hAnsi="Arial"/>
-                <w:b w:val="false"/>
-                <w:bCs w:val="false"/>
-                <w:color w:val="0F172A"/>
-                <w:sz w:val="19"/>
-                <w:szCs w:val="19"/>
-              </w:rPr>
-              <w:t xml:space="preserve">FrSky FLVSS / MLVSS</w:t>
-            </w:r>
-          </w:p>
-        </w:tc>
-        <w:tc>
-          <w:tcPr>
-            <w:tcW w:type="dxa" w:w="4226"/>
-            <w:tcBorders>
-              <w:top w:val="single" w:color="CBD5E1" w:sz="4"/>
-              <w:left w:val="single" w:color="CBD5E1" w:sz="4"/>
-              <w:bottom w:val="single" w:color="CBD5E1" w:sz="4"/>
-              <w:right w:val="single" w:color="CBD5E1" w:sz="4"/>
-            </w:tcBorders>
-            <w:shd w:fill="F1F5F9" w:color="auto" w:val="clear"/>
-            <w:tcMar>
-              <w:top w:type="dxa" w:w="60"/>
-              <w:left w:type="dxa" w:w="100"/>
-              <w:bottom w:type="dxa" w:w="60"/>
-              <w:right w:type="dxa" w:w="100"/>
-            </w:tcMar>
-          </w:tcPr>
-          <w:p>
-            <w:r>
-              <w:rPr>
-                <w:rFonts w:ascii="Arial" w:cs="Arial" w:eastAsia="Arial" w:hAnsi="Arial"/>
-                <w:b w:val="false"/>
-                <w:bCs w:val="false"/>
-                <w:color w:val="0F172A"/>
-                <w:sz w:val="19"/>
-                <w:szCs w:val="19"/>
-              </w:rPr>
-              <w:t xml:space="preserve">LiPo-Zellüberwachung über S.Port</w:t>
             </w:r>
           </w:p>
         </w:tc>
@@ -2263,7 +1981,7 @@
                 <w:sz w:val="19"/>
                 <w:szCs w:val="19"/>
               </w:rPr>
-              <w:t xml:space="preserve">Versorgung</w:t>
+              <w:t xml:space="preserve">–</w:t>
             </w:r>
           </w:p>
         </w:tc>
@@ -2293,7 +2011,7 @@
                 <w:sz w:val="19"/>
                 <w:szCs w:val="19"/>
               </w:rPr>
-              <w:t xml:space="preserve">MAX98357A SD</w:t>
+              <w:t xml:space="preserve">nicht gelötet</w:t>
             </w:r>
           </w:p>
         </w:tc>
@@ -2323,7 +2041,7 @@
                 <w:sz w:val="19"/>
                 <w:szCs w:val="19"/>
               </w:rPr>
-              <w:t xml:space="preserve">Verstärker immer an</w:t>
+              <w:t xml:space="preserve">SD offen = Verstärker an (Mono-Mix)</w:t>
             </w:r>
           </w:p>
         </w:tc>
@@ -3376,7 +3094,7 @@
                 <w:sz w:val="19"/>
                 <w:szCs w:val="19"/>
               </w:rPr>
-              <w:t xml:space="preserve">Geräte-TX / S.Port-Signal</w:t>
+              <w:t xml:space="preserve">Geräte-TX</w:t>
             </w:r>
           </w:p>
         </w:tc>
@@ -3529,7 +3247,7 @@
                 <w:sz w:val="19"/>
                 <w:szCs w:val="19"/>
               </w:rPr>
-              <w:t xml:space="preserve">Geräte-RX / über 1N4148 an S.Port</w:t>
+              <w:t xml:space="preserve">Geräte-RX</w:t>
             </w:r>
           </w:p>
         </w:tc>
@@ -3748,7 +3466,7 @@
                 <w:sz w:val="19"/>
                 <w:szCs w:val="19"/>
               </w:rPr>
-              <w:t xml:space="preserve">SD CS</w:t>
+              <w:t xml:space="preserve">frei</w:t>
             </w:r>
           </w:p>
         </w:tc>
@@ -3778,7 +3496,7 @@
                 <w:sz w:val="19"/>
                 <w:szCs w:val="19"/>
               </w:rPr>
-              <w:t xml:space="preserve">GPIO10</w:t>
+              <w:t xml:space="preserve">GPIO10–13</w:t>
             </w:r>
           </w:p>
         </w:tc>
@@ -3808,7 +3526,7 @@
                 <w:sz w:val="19"/>
                 <w:szCs w:val="19"/>
               </w:rPr>
-              <w:t xml:space="preserve">Ausgang</w:t>
+              <w:t xml:space="preserve"/>
             </w:r>
           </w:p>
         </w:tc>
@@ -3838,7 +3556,7 @@
                 <w:sz w:val="19"/>
                 <w:szCs w:val="19"/>
               </w:rPr>
-              <w:t xml:space="preserve">SD-Modul CS</w:t>
+              <w:t xml:space="preserve"/>
             </w:r>
           </w:p>
         </w:tc>
@@ -3868,7 +3586,7 @@
                 <w:sz w:val="19"/>
                 <w:szCs w:val="19"/>
               </w:rPr>
-              <w:t xml:space="preserve">nur mit SD-Karte</w:t>
+              <w:t xml:space="preserve">nicht anschließen</w:t>
             </w:r>
           </w:p>
         </w:tc>
@@ -3901,7 +3619,7 @@
                 <w:sz w:val="19"/>
                 <w:szCs w:val="19"/>
               </w:rPr>
-              <w:t xml:space="preserve">SD MOSI</w:t>
+              <w:t xml:space="preserve">Port C: RX</w:t>
             </w:r>
           </w:p>
         </w:tc>
@@ -3932,7 +3650,7 @@
                 <w:sz w:val="19"/>
                 <w:szCs w:val="19"/>
               </w:rPr>
-              <w:t xml:space="preserve">GPIO11</w:t>
+              <w:t xml:space="preserve">GPIO44 (RX)</w:t>
             </w:r>
           </w:p>
         </w:tc>
@@ -3963,7 +3681,7 @@
                 <w:sz w:val="19"/>
                 <w:szCs w:val="19"/>
               </w:rPr>
-              <w:t xml:space="preserve">Ausgang</w:t>
+              <w:t xml:space="preserve">Eingang</w:t>
             </w:r>
           </w:p>
         </w:tc>
@@ -3994,7 +3712,7 @@
                 <w:sz w:val="19"/>
                 <w:szCs w:val="19"/>
               </w:rPr>
-              <w:t xml:space="preserve">SD-Modul MOSI</w:t>
+              <w:t xml:space="preserve">Geräte-TX</w:t>
             </w:r>
           </w:p>
         </w:tc>
@@ -4025,7 +3743,7 @@
                 <w:sz w:val="19"/>
                 <w:szCs w:val="19"/>
               </w:rPr>
-              <w:t xml:space="preserve">Standard-SPI des S3</w:t>
+              <w:t xml:space="preserve"/>
             </w:r>
           </w:p>
         </w:tc>
@@ -4057,7 +3775,7 @@
                 <w:sz w:val="19"/>
                 <w:szCs w:val="19"/>
               </w:rPr>
-              <w:t xml:space="preserve">SD SCK</w:t>
+              <w:t xml:space="preserve">Port C: TX</w:t>
             </w:r>
           </w:p>
         </w:tc>
@@ -4087,7 +3805,7 @@
                 <w:sz w:val="19"/>
                 <w:szCs w:val="19"/>
               </w:rPr>
-              <w:t xml:space="preserve">GPIO12</w:t>
+              <w:t xml:space="preserve">GPIO43 (TX)</w:t>
             </w:r>
           </w:p>
         </w:tc>
@@ -4147,7 +3865,7 @@
                 <w:sz w:val="19"/>
                 <w:szCs w:val="19"/>
               </w:rPr>
-              <w:t xml:space="preserve">SD-Modul SCK</w:t>
+              <w:t xml:space="preserve">Geräte-RX</w:t>
             </w:r>
           </w:p>
         </w:tc>
@@ -4178,472 +3896,6 @@
                 <w:szCs w:val="19"/>
               </w:rPr>
               <w:t xml:space="preserve"/>
-            </w:r>
-          </w:p>
-        </w:tc>
-      </w:tr>
-      <w:tr>
-        <w:tc>
-          <w:tcPr>
-            <w:tcW w:type="dxa" w:w="1900"/>
-            <w:tcBorders>
-              <w:top w:val="single" w:color="CBD5E1" w:sz="4"/>
-              <w:left w:val="single" w:color="CBD5E1" w:sz="4"/>
-              <w:bottom w:val="single" w:color="CBD5E1" w:sz="4"/>
-              <w:right w:val="single" w:color="CBD5E1" w:sz="4"/>
-            </w:tcBorders>
-            <w:shd w:fill="F1F5F9" w:color="auto" w:val="clear"/>
-            <w:tcMar>
-              <w:top w:type="dxa" w:w="60"/>
-              <w:left w:type="dxa" w:w="100"/>
-              <w:bottom w:type="dxa" w:w="60"/>
-              <w:right w:type="dxa" w:w="100"/>
-            </w:tcMar>
-          </w:tcPr>
-          <w:p>
-            <w:r>
-              <w:rPr>
-                <w:rFonts w:ascii="Arial" w:cs="Arial" w:eastAsia="Arial" w:hAnsi="Arial"/>
-                <w:b w:val="false"/>
-                <w:bCs w:val="false"/>
-                <w:color w:val="0F172A"/>
-                <w:sz w:val="19"/>
-                <w:szCs w:val="19"/>
-              </w:rPr>
-              <w:t xml:space="preserve">SD MISO</w:t>
-            </w:r>
-          </w:p>
-        </w:tc>
-        <w:tc>
-          <w:tcPr>
-            <w:tcW w:type="dxa" w:w="1150"/>
-            <w:tcBorders>
-              <w:top w:val="single" w:color="CBD5E1" w:sz="4"/>
-              <w:left w:val="single" w:color="CBD5E1" w:sz="4"/>
-              <w:bottom w:val="single" w:color="CBD5E1" w:sz="4"/>
-              <w:right w:val="single" w:color="CBD5E1" w:sz="4"/>
-            </w:tcBorders>
-            <w:shd w:fill="F1F5F9" w:color="auto" w:val="clear"/>
-            <w:tcMar>
-              <w:top w:type="dxa" w:w="60"/>
-              <w:left w:type="dxa" w:w="100"/>
-              <w:bottom w:type="dxa" w:w="60"/>
-              <w:right w:type="dxa" w:w="100"/>
-            </w:tcMar>
-          </w:tcPr>
-          <w:p>
-            <w:r>
-              <w:rPr>
-                <w:rFonts w:ascii="Arial" w:cs="Arial" w:eastAsia="Arial" w:hAnsi="Arial"/>
-                <w:b/>
-                <w:bCs/>
-                <w:color w:val="0F172A"/>
-                <w:sz w:val="19"/>
-                <w:szCs w:val="19"/>
-              </w:rPr>
-              <w:t xml:space="preserve">GPIO13</w:t>
-            </w:r>
-          </w:p>
-        </w:tc>
-        <w:tc>
-          <w:tcPr>
-            <w:tcW w:type="dxa" w:w="1300"/>
-            <w:tcBorders>
-              <w:top w:val="single" w:color="CBD5E1" w:sz="4"/>
-              <w:left w:val="single" w:color="CBD5E1" w:sz="4"/>
-              <w:bottom w:val="single" w:color="CBD5E1" w:sz="4"/>
-              <w:right w:val="single" w:color="CBD5E1" w:sz="4"/>
-            </w:tcBorders>
-            <w:shd w:fill="F1F5F9" w:color="auto" w:val="clear"/>
-            <w:tcMar>
-              <w:top w:type="dxa" w:w="60"/>
-              <w:left w:type="dxa" w:w="100"/>
-              <w:bottom w:type="dxa" w:w="60"/>
-              <w:right w:type="dxa" w:w="100"/>
-            </w:tcMar>
-          </w:tcPr>
-          <w:p>
-            <w:r>
-              <w:rPr>
-                <w:rFonts w:ascii="Arial" w:cs="Arial" w:eastAsia="Arial" w:hAnsi="Arial"/>
-                <w:b w:val="false"/>
-                <w:bCs w:val="false"/>
-                <w:color w:val="0F172A"/>
-                <w:sz w:val="19"/>
-                <w:szCs w:val="19"/>
-              </w:rPr>
-              <w:t xml:space="preserve">Eingang</w:t>
-            </w:r>
-          </w:p>
-        </w:tc>
-        <w:tc>
-          <w:tcPr>
-            <w:tcW w:type="dxa" w:w="2300"/>
-            <w:tcBorders>
-              <w:top w:val="single" w:color="CBD5E1" w:sz="4"/>
-              <w:left w:val="single" w:color="CBD5E1" w:sz="4"/>
-              <w:bottom w:val="single" w:color="CBD5E1" w:sz="4"/>
-              <w:right w:val="single" w:color="CBD5E1" w:sz="4"/>
-            </w:tcBorders>
-            <w:shd w:fill="F1F5F9" w:color="auto" w:val="clear"/>
-            <w:tcMar>
-              <w:top w:type="dxa" w:w="60"/>
-              <w:left w:type="dxa" w:w="100"/>
-              <w:bottom w:type="dxa" w:w="60"/>
-              <w:right w:type="dxa" w:w="100"/>
-            </w:tcMar>
-          </w:tcPr>
-          <w:p>
-            <w:r>
-              <w:rPr>
-                <w:rFonts w:ascii="Arial" w:cs="Arial" w:eastAsia="Arial" w:hAnsi="Arial"/>
-                <w:b w:val="false"/>
-                <w:bCs w:val="false"/>
-                <w:color w:val="0F172A"/>
-                <w:sz w:val="19"/>
-                <w:szCs w:val="19"/>
-              </w:rPr>
-              <w:t xml:space="preserve">SD-Modul MISO</w:t>
-            </w:r>
-          </w:p>
-        </w:tc>
-        <w:tc>
-          <w:tcPr>
-            <w:tcW w:type="dxa" w:w="2376"/>
-            <w:tcBorders>
-              <w:top w:val="single" w:color="CBD5E1" w:sz="4"/>
-              <w:left w:val="single" w:color="CBD5E1" w:sz="4"/>
-              <w:bottom w:val="single" w:color="CBD5E1" w:sz="4"/>
-              <w:right w:val="single" w:color="CBD5E1" w:sz="4"/>
-            </w:tcBorders>
-            <w:shd w:fill="F1F5F9" w:color="auto" w:val="clear"/>
-            <w:tcMar>
-              <w:top w:type="dxa" w:w="60"/>
-              <w:left w:type="dxa" w:w="100"/>
-              <w:bottom w:type="dxa" w:w="60"/>
-              <w:right w:type="dxa" w:w="100"/>
-            </w:tcMar>
-          </w:tcPr>
-          <w:p>
-            <w:r>
-              <w:rPr>
-                <w:rFonts w:ascii="Arial" w:cs="Arial" w:eastAsia="Arial" w:hAnsi="Arial"/>
-                <w:b w:val="false"/>
-                <w:bCs w:val="false"/>
-                <w:color w:val="0F172A"/>
-                <w:sz w:val="19"/>
-                <w:szCs w:val="19"/>
-              </w:rPr>
-              <w:t xml:space="preserve"/>
-            </w:r>
-          </w:p>
-        </w:tc>
-      </w:tr>
-      <w:tr>
-        <w:tc>
-          <w:tcPr>
-            <w:tcW w:type="dxa" w:w="1900"/>
-            <w:tcBorders>
-              <w:top w:val="single" w:color="CBD5E1" w:sz="4"/>
-              <w:left w:val="single" w:color="CBD5E1" w:sz="4"/>
-              <w:bottom w:val="single" w:color="CBD5E1" w:sz="4"/>
-              <w:right w:val="single" w:color="CBD5E1" w:sz="4"/>
-            </w:tcBorders>
-            <w:tcMar>
-              <w:top w:type="dxa" w:w="60"/>
-              <w:left w:type="dxa" w:w="100"/>
-              <w:bottom w:type="dxa" w:w="60"/>
-              <w:right w:type="dxa" w:w="100"/>
-            </w:tcMar>
-          </w:tcPr>
-          <w:p>
-            <w:r>
-              <w:rPr>
-                <w:rFonts w:ascii="Arial" w:cs="Arial" w:eastAsia="Arial" w:hAnsi="Arial"/>
-                <w:b w:val="false"/>
-                <w:bCs w:val="false"/>
-                <w:color w:val="0F172A"/>
-                <w:sz w:val="19"/>
-                <w:szCs w:val="19"/>
-              </w:rPr>
-              <w:t xml:space="preserve">Port C: GPS RX</w:t>
-            </w:r>
-          </w:p>
-        </w:tc>
-        <w:tc>
-          <w:tcPr>
-            <w:tcW w:type="dxa" w:w="1150"/>
-            <w:tcBorders>
-              <w:top w:val="single" w:color="CBD5E1" w:sz="4"/>
-              <w:left w:val="single" w:color="CBD5E1" w:sz="4"/>
-              <w:bottom w:val="single" w:color="CBD5E1" w:sz="4"/>
-              <w:right w:val="single" w:color="CBD5E1" w:sz="4"/>
-            </w:tcBorders>
-            <w:tcMar>
-              <w:top w:type="dxa" w:w="60"/>
-              <w:left w:type="dxa" w:w="100"/>
-              <w:bottom w:type="dxa" w:w="60"/>
-              <w:right w:type="dxa" w:w="100"/>
-            </w:tcMar>
-          </w:tcPr>
-          <w:p>
-            <w:r>
-              <w:rPr>
-                <w:rFonts w:ascii="Arial" w:cs="Arial" w:eastAsia="Arial" w:hAnsi="Arial"/>
-                <w:b/>
-                <w:bCs/>
-                <w:color w:val="0F172A"/>
-                <w:sz w:val="19"/>
-                <w:szCs w:val="19"/>
-              </w:rPr>
-              <w:t xml:space="preserve">GPIO44 (RX)</w:t>
-            </w:r>
-          </w:p>
-        </w:tc>
-        <w:tc>
-          <w:tcPr>
-            <w:tcW w:type="dxa" w:w="1300"/>
-            <w:tcBorders>
-              <w:top w:val="single" w:color="CBD5E1" w:sz="4"/>
-              <w:left w:val="single" w:color="CBD5E1" w:sz="4"/>
-              <w:bottom w:val="single" w:color="CBD5E1" w:sz="4"/>
-              <w:right w:val="single" w:color="CBD5E1" w:sz="4"/>
-            </w:tcBorders>
-            <w:tcMar>
-              <w:top w:type="dxa" w:w="60"/>
-              <w:left w:type="dxa" w:w="100"/>
-              <w:bottom w:type="dxa" w:w="60"/>
-              <w:right w:type="dxa" w:w="100"/>
-            </w:tcMar>
-          </w:tcPr>
-          <w:p>
-            <w:r>
-              <w:rPr>
-                <w:rFonts w:ascii="Arial" w:cs="Arial" w:eastAsia="Arial" w:hAnsi="Arial"/>
-                <w:b w:val="false"/>
-                <w:bCs w:val="false"/>
-                <w:color w:val="0F172A"/>
-                <w:sz w:val="19"/>
-                <w:szCs w:val="19"/>
-              </w:rPr>
-              <w:t xml:space="preserve">Eingang</w:t>
-            </w:r>
-          </w:p>
-        </w:tc>
-        <w:tc>
-          <w:tcPr>
-            <w:tcW w:type="dxa" w:w="2300"/>
-            <w:tcBorders>
-              <w:top w:val="single" w:color="CBD5E1" w:sz="4"/>
-              <w:left w:val="single" w:color="CBD5E1" w:sz="4"/>
-              <w:bottom w:val="single" w:color="CBD5E1" w:sz="4"/>
-              <w:right w:val="single" w:color="CBD5E1" w:sz="4"/>
-            </w:tcBorders>
-            <w:tcMar>
-              <w:top w:type="dxa" w:w="60"/>
-              <w:left w:type="dxa" w:w="100"/>
-              <w:bottom w:type="dxa" w:w="60"/>
-              <w:right w:type="dxa" w:w="100"/>
-            </w:tcMar>
-          </w:tcPr>
-          <w:p>
-            <w:r>
-              <w:rPr>
-                <w:rFonts w:ascii="Arial" w:cs="Arial" w:eastAsia="Arial" w:hAnsi="Arial"/>
-                <w:b w:val="false"/>
-                <w:bCs w:val="false"/>
-                <w:color w:val="0F172A"/>
-                <w:sz w:val="19"/>
-                <w:szCs w:val="19"/>
-              </w:rPr>
-              <w:t xml:space="preserve">GPS TX</w:t>
-            </w:r>
-          </w:p>
-        </w:tc>
-        <w:tc>
-          <w:tcPr>
-            <w:tcW w:type="dxa" w:w="2376"/>
-            <w:tcBorders>
-              <w:top w:val="single" w:color="CBD5E1" w:sz="4"/>
-              <w:left w:val="single" w:color="CBD5E1" w:sz="4"/>
-              <w:bottom w:val="single" w:color="CBD5E1" w:sz="4"/>
-              <w:right w:val="single" w:color="CBD5E1" w:sz="4"/>
-            </w:tcBorders>
-            <w:tcMar>
-              <w:top w:type="dxa" w:w="60"/>
-              <w:left w:type="dxa" w:w="100"/>
-              <w:bottom w:type="dxa" w:w="60"/>
-              <w:right w:type="dxa" w:w="100"/>
-            </w:tcMar>
-          </w:tcPr>
-          <w:p>
-            <w:r>
-              <w:rPr>
-                <w:rFonts w:ascii="Arial" w:cs="Arial" w:eastAsia="Arial" w:hAnsi="Arial"/>
-                <w:b w:val="false"/>
-                <w:bCs w:val="false"/>
-                <w:color w:val="0F172A"/>
-                <w:sz w:val="19"/>
-                <w:szCs w:val="19"/>
-              </w:rPr>
-              <w:t xml:space="preserve">Software-UART</w:t>
-            </w:r>
-          </w:p>
-        </w:tc>
-      </w:tr>
-      <w:tr>
-        <w:tc>
-          <w:tcPr>
-            <w:tcW w:type="dxa" w:w="1900"/>
-            <w:tcBorders>
-              <w:top w:val="single" w:color="CBD5E1" w:sz="4"/>
-              <w:left w:val="single" w:color="CBD5E1" w:sz="4"/>
-              <w:bottom w:val="single" w:color="CBD5E1" w:sz="4"/>
-              <w:right w:val="single" w:color="CBD5E1" w:sz="4"/>
-            </w:tcBorders>
-            <w:shd w:fill="F1F5F9" w:color="auto" w:val="clear"/>
-            <w:tcMar>
-              <w:top w:type="dxa" w:w="60"/>
-              <w:left w:type="dxa" w:w="100"/>
-              <w:bottom w:type="dxa" w:w="60"/>
-              <w:right w:type="dxa" w:w="100"/>
-            </w:tcMar>
-          </w:tcPr>
-          <w:p>
-            <w:r>
-              <w:rPr>
-                <w:rFonts w:ascii="Arial" w:cs="Arial" w:eastAsia="Arial" w:hAnsi="Arial"/>
-                <w:b w:val="false"/>
-                <w:bCs w:val="false"/>
-                <w:color w:val="0F172A"/>
-                <w:sz w:val="19"/>
-                <w:szCs w:val="19"/>
-              </w:rPr>
-              <w:t xml:space="preserve">Port C: GPS TX</w:t>
-            </w:r>
-          </w:p>
-        </w:tc>
-        <w:tc>
-          <w:tcPr>
-            <w:tcW w:type="dxa" w:w="1150"/>
-            <w:tcBorders>
-              <w:top w:val="single" w:color="CBD5E1" w:sz="4"/>
-              <w:left w:val="single" w:color="CBD5E1" w:sz="4"/>
-              <w:bottom w:val="single" w:color="CBD5E1" w:sz="4"/>
-              <w:right w:val="single" w:color="CBD5E1" w:sz="4"/>
-            </w:tcBorders>
-            <w:shd w:fill="F1F5F9" w:color="auto" w:val="clear"/>
-            <w:tcMar>
-              <w:top w:type="dxa" w:w="60"/>
-              <w:left w:type="dxa" w:w="100"/>
-              <w:bottom w:type="dxa" w:w="60"/>
-              <w:right w:type="dxa" w:w="100"/>
-            </w:tcMar>
-          </w:tcPr>
-          <w:p>
-            <w:r>
-              <w:rPr>
-                <w:rFonts w:ascii="Arial" w:cs="Arial" w:eastAsia="Arial" w:hAnsi="Arial"/>
-                <w:b/>
-                <w:bCs/>
-                <w:color w:val="0F172A"/>
-                <w:sz w:val="19"/>
-                <w:szCs w:val="19"/>
-              </w:rPr>
-              <w:t xml:space="preserve">GPIO43 (TX)</w:t>
-            </w:r>
-          </w:p>
-        </w:tc>
-        <w:tc>
-          <w:tcPr>
-            <w:tcW w:type="dxa" w:w="1300"/>
-            <w:tcBorders>
-              <w:top w:val="single" w:color="CBD5E1" w:sz="4"/>
-              <w:left w:val="single" w:color="CBD5E1" w:sz="4"/>
-              <w:bottom w:val="single" w:color="CBD5E1" w:sz="4"/>
-              <w:right w:val="single" w:color="CBD5E1" w:sz="4"/>
-            </w:tcBorders>
-            <w:shd w:fill="F1F5F9" w:color="auto" w:val="clear"/>
-            <w:tcMar>
-              <w:top w:type="dxa" w:w="60"/>
-              <w:left w:type="dxa" w:w="100"/>
-              <w:bottom w:type="dxa" w:w="60"/>
-              <w:right w:type="dxa" w:w="100"/>
-            </w:tcMar>
-          </w:tcPr>
-          <w:p>
-            <w:r>
-              <w:rPr>
-                <w:rFonts w:ascii="Arial" w:cs="Arial" w:eastAsia="Arial" w:hAnsi="Arial"/>
-                <w:b w:val="false"/>
-                <w:bCs w:val="false"/>
-                <w:color w:val="0F172A"/>
-                <w:sz w:val="19"/>
-                <w:szCs w:val="19"/>
-              </w:rPr>
-              <w:t xml:space="preserve">Ausgang</w:t>
-            </w:r>
-          </w:p>
-        </w:tc>
-        <w:tc>
-          <w:tcPr>
-            <w:tcW w:type="dxa" w:w="2300"/>
-            <w:tcBorders>
-              <w:top w:val="single" w:color="CBD5E1" w:sz="4"/>
-              <w:left w:val="single" w:color="CBD5E1" w:sz="4"/>
-              <w:bottom w:val="single" w:color="CBD5E1" w:sz="4"/>
-              <w:right w:val="single" w:color="CBD5E1" w:sz="4"/>
-            </w:tcBorders>
-            <w:shd w:fill="F1F5F9" w:color="auto" w:val="clear"/>
-            <w:tcMar>
-              <w:top w:type="dxa" w:w="60"/>
-              <w:left w:type="dxa" w:w="100"/>
-              <w:bottom w:type="dxa" w:w="60"/>
-              <w:right w:type="dxa" w:w="100"/>
-            </w:tcMar>
-          </w:tcPr>
-          <w:p>
-            <w:r>
-              <w:rPr>
-                <w:rFonts w:ascii="Arial" w:cs="Arial" w:eastAsia="Arial" w:hAnsi="Arial"/>
-                <w:b w:val="false"/>
-                <w:bCs w:val="false"/>
-                <w:color w:val="0F172A"/>
-                <w:sz w:val="19"/>
-                <w:szCs w:val="19"/>
-              </w:rPr>
-              <w:t xml:space="preserve">GPS RX</w:t>
-            </w:r>
-          </w:p>
-        </w:tc>
-        <w:tc>
-          <w:tcPr>
-            <w:tcW w:type="dxa" w:w="2376"/>
-            <w:tcBorders>
-              <w:top w:val="single" w:color="CBD5E1" w:sz="4"/>
-              <w:left w:val="single" w:color="CBD5E1" w:sz="4"/>
-              <w:bottom w:val="single" w:color="CBD5E1" w:sz="4"/>
-              <w:right w:val="single" w:color="CBD5E1" w:sz="4"/>
-            </w:tcBorders>
-            <w:shd w:fill="F1F5F9" w:color="auto" w:val="clear"/>
-            <w:tcMar>
-              <w:top w:type="dxa" w:w="60"/>
-              <w:left w:type="dxa" w:w="100"/>
-              <w:bottom w:type="dxa" w:w="60"/>
-              <w:right w:type="dxa" w:w="100"/>
-            </w:tcMar>
-          </w:tcPr>
-          <w:p>
-            <w:r>
-              <w:rPr>
-                <w:rFonts w:ascii="Arial" w:cs="Arial" w:eastAsia="Arial" w:hAnsi="Arial"/>
-                <w:b w:val="false"/>
-                <w:bCs w:val="false"/>
-                <w:color w:val="0F172A"/>
-                <w:sz w:val="19"/>
-                <w:szCs w:val="19"/>
-              </w:rPr>
-              <w:t xml:space="preserve">GPS-Konfiguration wird gesendet</w:t>
             </w:r>
           </w:p>
         </w:tc>
@@ -4730,7 +3982,7 @@
           <w:sz w:val="22"/>
           <w:szCs w:val="22"/>
         </w:rPr>
-        <w:t xml:space="preserve">GPIO 19 und 20 sind der USB-Anschluss (Flashen und Konsole). Deshalb ist UART0 auf IO43/IO44 frei für das GPS. Beim Einschalten gibt der S3 kurz ein Startprotokoll auf IO43 aus; das GPS ignoriert es.</w:t>
+        <w:t xml:space="preserve">GPIO 19 und 20 sind der USB-Anschluss (Flashen und Konsole). Deshalb ist UART0 auf IO43/IO44 frei für Port C. Beim Einschalten gibt der S3 kurz ein Startprotokoll auf IO43 aus.</w:t>
       </w:r>
     </w:p>
     <w:p>
@@ -4784,7 +4036,7 @@
           <w:sz w:val="22"/>
           <w:szCs w:val="22"/>
         </w:rPr>
-        <w:t xml:space="preserve">Jede Linie ist eine Leitung. Der Pfeil zeigt, in welche Richtung das Signal läuft. Rote Kästchen (+5V, +3V3) und Massesymbole sind gemeinsame Leitungen: alle gleich beschrifteten Punkte werden miteinander verbunden.</w:t>
+        <w:t xml:space="preserve">Jede Linie ist eine Leitung. Der Pfeil zeigt, in welche Richtung das Signal läuft. Rote Kästchen (+5V) und Massesymbole sind gemeinsame Leitungen: alle gleich beschrifteten Punkte werden miteinander verbunden.</w:t>
       </w:r>
     </w:p>
     <w:p>
@@ -4795,7 +4047,7 @@
       <w:r>
         <w:drawing>
           <wp:inline distT="0" distB="0" distL="0" distR="0">
-            <wp:extent cx="7524750" cy="4876800"/>
+            <wp:extent cx="7524750" cy="4305300"/>
             <wp:effectExtent t="0" r="0" b="0" l="0"/>
             <wp:docPr id="1" name="verdrahtung_S3.png" descr="Bild 2: Verdrahtungsplan Mini S3" title="Bild 2: Verdrahtungsplan Mini S3"/>
             <wp:cNvGraphicFramePr>
@@ -4820,7 +4072,7 @@
                   <pic:spPr bwMode="auto">
                     <a:xfrm>
                       <a:off x="0" y="0"/>
-                      <a:ext cx="7524750" cy="4876800"/>
+                      <a:ext cx="7524750" cy="4305300"/>
                     </a:xfrm>
                     <a:prstGeom prst="rect">
                       <a:avLst/>
@@ -4883,7 +4135,7 @@
           <w:sz w:val="22"/>
           <w:szCs w:val="22"/>
         </w:rPr>
-        <w:t xml:space="preserve">Der MAX98357A wird ohne Kabel direkt auf die Versorgungsreihe des Waveshare ESP32-S3-Zero gelötet. Die 7 Pins des MAX (LRC, BCLK, DIN, GAIN, SD, GND, VIN) treffen dabei in umgekehrter Reihenfolge genau auf 5V, GND, 3V3, IO1, IO2, IO3, IO4. VIN muss auf 5V liegen, GND auf GND.</w:t>
+        <w:t xml:space="preserve">Der MAX98357A wird ohne Kabel direkt auf die Versorgungsreihe des Waveshare ESP32-S3-Zero gelötet. Die 7 Pins des MAX (LRC, BCLK, DIN, GAIN, SD, GND, VIN) treffen dabei in umgekehrter Reihenfolge genau auf 5V, GND, 3V3, IO1, IO2, IO3, IO4. VIN muss auf 5V liegen, GND auf GND. Der SD-Pin wird nicht angelötet.</w:t>
       </w:r>
     </w:p>
     <w:p>
@@ -4964,7 +4216,7 @@
           <w:sz w:val="22"/>
           <w:szCs w:val="22"/>
         </w:rPr>
-        <w:t xml:space="preserve">SD liegt auf 3V3: Der Verstärker ist immer eingeschaltet und gibt den linken Kanal aus. Die Firmware schreibt das Mono-Signal auf beide Kanäle, es fehlt also nichts.</w:t>
+        <w:t xml:space="preserve">Den SD-Pin des MAX nicht anlöten, der 3V3-Pin des ESP bleibt frei. Am einfachsten den SD-Stift aus der Stiftleiste ziehen oder kürzen. Offen schaltet ein Widerstand auf dem MAX-Board den Verstärker ein, er gibt dann das Mono-Signal aus.</w:t>
       </w:r>
     </w:p>
     <w:p>
@@ -5018,7 +4270,7 @@
           <w:sz w:val="22"/>
           <w:szCs w:val="22"/>
         </w:rPr>
-        <w:t xml:space="preserve">Die übrigen Geräte (Port A, B, C) holen +5V und GND an denselben Lötstellen ab. Am einfachsten über die VIN- und GND-Pins des MAX.</w:t>
+        <w:t xml:space="preserve">Port A holt +5V und GND an denselben Lötstellen ab, am einfachsten über die VIN- und GND-Pins des MAX.</w:t>
       </w:r>
     </w:p>
     <w:p>
@@ -5043,7 +4295,7 @@
           <w:sz w:val="22"/>
           <w:szCs w:val="22"/>
         </w:rPr>
-        <w:t xml:space="preserve">Die Reihenfolge ist ein Vorschlag. Wichtig ist nur, dass TX des Geräts an RX des ESP geht und umgekehrt.</w:t>
+        <w:t xml:space="preserve">Port A hat 4 Pins wie der Empfängerstecker. Port B und Port C haben nur RX und TX. Wichtig ist, dass TX des Geräts an RX des ESP geht und umgekehrt.</w:t>
       </w:r>
     </w:p>
     <w:p>
@@ -5118,12 +4370,17 @@
         <w:rPr>
           <w:rFonts w:ascii="Arial" w:cs="Arial" w:eastAsia="Arial" w:hAnsi="Arial"/>
         </w:rPr>
-        <w:t xml:space="preserve">7. Port B als S.Port (LiPo-Sensor)</w:t>
-      </w:r>
-    </w:p>
-    <w:p>
-      <w:pPr>
-        <w:spacing w:after="120"/>
+        <w:t xml:space="preserve">7. Stromversorgung</w:t>
+      </w:r>
+    </w:p>
+    <w:p>
+      <w:pPr>
+        <w:pStyle w:val="ListParagraph"/>
+        <w:numPr>
+          <w:ilvl w:val="0"/>
+          <w:numId w:val="2"/>
+        </w:numPr>
+        <w:spacing w:after="80"/>
       </w:pPr>
       <w:r>
         <w:rPr>
@@ -5131,7 +4388,73 @@
           <w:sz w:val="22"/>
           <w:szCs w:val="22"/>
         </w:rPr>
-        <w:t xml:space="preserve">Der FrSky-S.Port ist eine Eindrahtleitung. Der ESP hört mit RX direkt mit und sendet mit TX über eine Diode 1N4148. Der Ring der Diode (Kathode) zeigt zur S.Port-Leitung.</w:t>
+        <w:t xml:space="preserve">Alles läuft mit +5 V aus dem BEC des Reglers bzw. dem Empfängerstecker (Port A). Die +5-V-Leitung geht an den 5V-Pin des ESP-Boards, dort sitzt auch VIN des MAX.</w:t>
+      </w:r>
+    </w:p>
+    <w:p>
+      <w:pPr>
+        <w:pStyle w:val="ListParagraph"/>
+        <w:numPr>
+          <w:ilvl w:val="0"/>
+          <w:numId w:val="2"/>
+        </w:numPr>
+        <w:spacing w:after="80"/>
+      </w:pPr>
+      <w:r>
+        <w:rPr>
+          <w:rFonts w:ascii="Arial" w:cs="Arial" w:eastAsia="Arial" w:hAnsi="Arial"/>
+          <w:sz w:val="22"/>
+          <w:szCs w:val="22"/>
+        </w:rPr>
+        <w:t xml:space="preserve">Strombedarf: ESP mit WLAN bis ca. 0,35 A, Verstärker bei voller Lautstärke an 4 Ω Spitzen bis ca. 0,8 A. Das BEC sollte mindestens 1,5 A liefern können.</w:t>
+      </w:r>
+    </w:p>
+    <w:p>
+      <w:pPr>
+        <w:pStyle w:val="ListParagraph"/>
+        <w:numPr>
+          <w:ilvl w:val="0"/>
+          <w:numId w:val="2"/>
+        </w:numPr>
+        <w:spacing w:after="80"/>
+      </w:pPr>
+      <w:r>
+        <w:rPr>
+          <w:rFonts w:ascii="Arial" w:cs="Arial" w:eastAsia="Arial" w:hAnsi="Arial"/>
+          <w:sz w:val="22"/>
+          <w:szCs w:val="22"/>
+        </w:rPr>
+        <w:t xml:space="preserve">Der 3V3-Pin des ESP-Boards bleibt frei.</w:t>
+      </w:r>
+    </w:p>
+    <w:p>
+      <w:pPr>
+        <w:pStyle w:val="ListParagraph"/>
+        <w:numPr>
+          <w:ilvl w:val="0"/>
+          <w:numId w:val="2"/>
+        </w:numPr>
+        <w:spacing w:after="80"/>
+      </w:pPr>
+      <w:r>
+        <w:rPr>
+          <w:rFonts w:ascii="Arial" w:cs="Arial" w:eastAsia="Arial" w:hAnsi="Arial"/>
+          <w:sz w:val="22"/>
+          <w:szCs w:val="22"/>
+        </w:rPr>
+        <w:t xml:space="preserve">Beim Flashen über USB vorher den Akku bzw. das BEC abziehen, damit nicht zwei 5-V-Quellen gegeneinander arbeiten.</w:t>
+      </w:r>
+    </w:p>
+    <w:p>
+      <w:pPr>
+        <w:pStyle w:val="Heading1"/>
+        <w:spacing w:after="160" w:before="300"/>
+      </w:pPr>
+      <w:r>
+        <w:rPr>
+          <w:rFonts w:ascii="Arial" w:cs="Arial" w:eastAsia="Arial" w:hAnsi="Arial"/>
+        </w:rPr>
+        <w:t xml:space="preserve">8. Bauplan Schritt für Schritt</w:t>
       </w:r>
     </w:p>
     <w:p>
@@ -5142,9 +4465,9 @@
       <w:r>
         <w:drawing>
           <wp:inline distT="0" distB="0" distL="0" distR="0">
-            <wp:extent cx="5715000" cy="2000250"/>
+            <wp:extent cx="5715000" cy="3333750"/>
             <wp:effectExtent t="0" r="0" b="0" l="0"/>
-            <wp:docPr id="1" name="sport_S3.png" descr="Bild 5: S.Port-Anschluss an Port B" title="Bild 5: S.Port-Anschluss an Port B"/>
+            <wp:docPr id="1" name="aufbau_S3.png" descr="Bild 5: Anordnungsvorschlag auf Lochraster (Mini S3)" title="Bild 5: Anordnungsvorschlag auf Lochraster (Mini S3)"/>
             <wp:cNvGraphicFramePr>
               <a:graphicFrameLocks xmlns:a="http://schemas.openxmlformats.org/drawingml/2006/main" noChangeAspect="1"/>
             </wp:cNvGraphicFramePr>
@@ -5167,183 +4490,6 @@
                   <pic:spPr bwMode="auto">
                     <a:xfrm>
                       <a:off x="0" y="0"/>
-                      <a:ext cx="5715000" cy="2000250"/>
-                    </a:xfrm>
-                    <a:prstGeom prst="rect">
-                      <a:avLst/>
-                    </a:prstGeom>
-                  </pic:spPr>
-                </pic:pic>
-              </a:graphicData>
-            </a:graphic>
-          </wp:inline>
-        </w:drawing>
-      </w:r>
-    </w:p>
-    <w:p>
-      <w:pPr>
-        <w:spacing w:after="200"/>
-        <w:jc w:val="center"/>
-      </w:pPr>
-      <w:r>
-        <w:rPr>
-          <w:rFonts w:ascii="Arial" w:cs="Arial" w:eastAsia="Arial" w:hAnsi="Arial"/>
-          <w:i/>
-          <w:iCs/>
-          <w:color w:val="64748B"/>
-          <w:sz w:val="18"/>
-          <w:szCs w:val="18"/>
-        </w:rPr>
-        <w:t xml:space="preserve">Bild 5: S.Port-Anschluss an Port B</w:t>
-      </w:r>
-    </w:p>
-    <w:p>
-      <w:pPr>
-        <w:pStyle w:val="Heading1"/>
-        <w:spacing w:after="160" w:before="300"/>
-      </w:pPr>
-      <w:r>
-        <w:rPr>
-          <w:rFonts w:ascii="Arial" w:cs="Arial" w:eastAsia="Arial" w:hAnsi="Arial"/>
-        </w:rPr>
-        <w:t xml:space="preserve">8. Stromversorgung</w:t>
-      </w:r>
-    </w:p>
-    <w:p>
-      <w:pPr>
-        <w:pStyle w:val="ListParagraph"/>
-        <w:numPr>
-          <w:ilvl w:val="0"/>
-          <w:numId w:val="2"/>
-        </w:numPr>
-        <w:spacing w:after="80"/>
-      </w:pPr>
-      <w:r>
-        <w:rPr>
-          <w:rFonts w:ascii="Arial" w:cs="Arial" w:eastAsia="Arial" w:hAnsi="Arial"/>
-          <w:sz w:val="22"/>
-          <w:szCs w:val="22"/>
-        </w:rPr>
-        <w:t xml:space="preserve">Alles läuft mit +5 V aus dem BEC des Reglers bzw. dem Empfängerstecker (Port A). Die +5-V-Leitung geht an den 5V-Pin des ESP-Boards (dort sitzt auch VIN des MAX) und an die Ports B und C.</w:t>
-      </w:r>
-    </w:p>
-    <w:p>
-      <w:pPr>
-        <w:pStyle w:val="ListParagraph"/>
-        <w:numPr>
-          <w:ilvl w:val="0"/>
-          <w:numId w:val="2"/>
-        </w:numPr>
-        <w:spacing w:after="80"/>
-      </w:pPr>
-      <w:r>
-        <w:rPr>
-          <w:rFonts w:ascii="Arial" w:cs="Arial" w:eastAsia="Arial" w:hAnsi="Arial"/>
-          <w:sz w:val="22"/>
-          <w:szCs w:val="22"/>
-        </w:rPr>
-        <w:t xml:space="preserve">Strombedarf: ESP mit WLAN bis ca. 0,35 A, Verstärker bei voller Lautstärke an 4 Ω Spitzen bis ca. 0,8 A. Das BEC sollte mindestens 1,5 A liefern können.</w:t>
-      </w:r>
-    </w:p>
-    <w:p>
-      <w:pPr>
-        <w:pStyle w:val="ListParagraph"/>
-        <w:numPr>
-          <w:ilvl w:val="0"/>
-          <w:numId w:val="2"/>
-        </w:numPr>
-        <w:spacing w:after="80"/>
-      </w:pPr>
-      <w:r>
-        <w:rPr>
-          <w:rFonts w:ascii="Arial" w:cs="Arial" w:eastAsia="Arial" w:hAnsi="Arial"/>
-          <w:sz w:val="22"/>
-          <w:szCs w:val="22"/>
-        </w:rPr>
-        <w:t xml:space="preserve">Der Elko am Verstärker fängt Stromspitzen ab. Ohne ihn kann der ESP bei lauten Sounds neu starten.</w:t>
-      </w:r>
-    </w:p>
-    <w:p>
-      <w:pPr>
-        <w:pStyle w:val="ListParagraph"/>
-        <w:numPr>
-          <w:ilvl w:val="0"/>
-          <w:numId w:val="2"/>
-        </w:numPr>
-        <w:spacing w:after="80"/>
-      </w:pPr>
-      <w:r>
-        <w:rPr>
-          <w:rFonts w:ascii="Arial" w:cs="Arial" w:eastAsia="Arial" w:hAnsi="Arial"/>
-          <w:sz w:val="22"/>
-          <w:szCs w:val="22"/>
-        </w:rPr>
-        <w:t xml:space="preserve">Der 3V3-Pin ist ein Ausgang des ESP-Boards. Er versorgt nur das SD-Modul (3,3-V-Typ).</w:t>
-      </w:r>
-    </w:p>
-    <w:p>
-      <w:pPr>
-        <w:pStyle w:val="ListParagraph"/>
-        <w:numPr>
-          <w:ilvl w:val="0"/>
-          <w:numId w:val="2"/>
-        </w:numPr>
-        <w:spacing w:after="80"/>
-      </w:pPr>
-      <w:r>
-        <w:rPr>
-          <w:rFonts w:ascii="Arial" w:cs="Arial" w:eastAsia="Arial" w:hAnsi="Arial"/>
-          <w:sz w:val="22"/>
-          <w:szCs w:val="22"/>
-        </w:rPr>
-        <w:t xml:space="preserve">Beim Flashen über USB vorher den Akku bzw. das BEC abziehen, damit nicht zwei 5-V-Quellen gegeneinander arbeiten.</w:t>
-      </w:r>
-    </w:p>
-    <w:p>
-      <w:pPr>
-        <w:pStyle w:val="Heading1"/>
-        <w:spacing w:after="160" w:before="300"/>
-      </w:pPr>
-      <w:r>
-        <w:rPr>
-          <w:rFonts w:ascii="Arial" w:cs="Arial" w:eastAsia="Arial" w:hAnsi="Arial"/>
-        </w:rPr>
-        <w:t xml:space="preserve">9. Bauplan Schritt für Schritt</w:t>
-      </w:r>
-    </w:p>
-    <w:p>
-      <w:pPr>
-        <w:spacing w:after="60" w:before="120"/>
-        <w:jc w:val="center"/>
-      </w:pPr>
-      <w:r>
-        <w:drawing>
-          <wp:inline distT="0" distB="0" distL="0" distR="0">
-            <wp:extent cx="5715000" cy="3333750"/>
-            <wp:effectExtent t="0" r="0" b="0" l="0"/>
-            <wp:docPr id="1" name="aufbau_S3.png" descr="Bild 6: Anordnungsvorschlag auf Lochraster (Mini S3)" title="Bild 6: Anordnungsvorschlag auf Lochraster (Mini S3)"/>
-            <wp:cNvGraphicFramePr>
-              <a:graphicFrameLocks xmlns:a="http://schemas.openxmlformats.org/drawingml/2006/main" noChangeAspect="1"/>
-            </wp:cNvGraphicFramePr>
-            <a:graphic xmlns:a="http://schemas.openxmlformats.org/drawingml/2006/main">
-              <a:graphicData uri="http://schemas.openxmlformats.org/drawingml/2006/picture">
-                <pic:pic xmlns:pic="http://schemas.openxmlformats.org/drawingml/2006/picture">
-                  <pic:nvPicPr>
-                    <pic:cNvPr id="0" name="" descr=""/>
-                    <pic:cNvPicPr>
-                      <a:picLocks noChangeAspect="1" noChangeArrowheads="1"/>
-                    </pic:cNvPicPr>
-                  </pic:nvPicPr>
-                  <pic:blipFill>
-                    <a:blip r:embed="rId15" cstate="none"/>
-                    <a:srcRect/>
-                    <a:stretch>
-                      <a:fillRect/>
-                    </a:stretch>
-                  </pic:blipFill>
-                  <pic:spPr bwMode="auto">
-                    <a:xfrm>
-                      <a:off x="0" y="0"/>
                       <a:ext cx="5715000" cy="3333750"/>
                     </a:xfrm>
                     <a:prstGeom prst="rect">
@@ -5371,7 +4517,7 @@
           <w:sz w:val="18"/>
           <w:szCs w:val="18"/>
         </w:rPr>
-        <w:t xml:space="preserve">Bild 6: Anordnungsvorschlag auf Lochraster (Mini S3)</w:t>
+        <w:t xml:space="preserve">Bild 5: Anordnungsvorschlag auf Lochraster (Mini S3)</w:t>
       </w:r>
     </w:p>
     <w:p>
@@ -5399,7 +4545,7 @@
           <w:sz w:val="22"/>
           <w:szCs w:val="22"/>
         </w:rPr>
-        <w:t xml:space="preserve">ESP-Board per USB anschließen und die Firmware flashen (siehe Abschnitt 10). Erst wenn das Board läuft, weiterbauen.</w:t>
+        <w:t xml:space="preserve">ESP-Board per USB anschließen und die Firmware flashen (siehe Abschnitt 9). Erst wenn das Board läuft, weiterbauen.</w:t>
       </w:r>
     </w:p>
     <w:p>
@@ -5427,7 +4573,7 @@
           <w:sz w:val="22"/>
           <w:szCs w:val="22"/>
         </w:rPr>
-        <w:t xml:space="preserve">Bauteile nach Bild 6 auflegen: ESP mit aufgelötetem MAX an eine Kante (USB-C zugänglich), Stecker an die gegenüberliegende Kante.</w:t>
+        <w:t xml:space="preserve">Bauteile nach Bild 5 auflegen: ESP mit aufgelötetem MAX an eine Kante (USB-C zugänglich), Stecker an die gegenüberliegende Kante.</w:t>
       </w:r>
     </w:p>
     <w:p>
@@ -5511,7 +4657,7 @@
           <w:sz w:val="22"/>
           <w:szCs w:val="22"/>
         </w:rPr>
-        <w:t xml:space="preserve">Den MAX98357A mit seiner 7-poligen Stiftleiste so auf die Versorgungsreihe setzen, dass VIN auf 5V und LRC auf IO4 liegt (Bild 3). Vor dem Löten mit dem Multimeter prüfen: VIN–5V und GND–GND. Den Elko (220 µF) direkt an VIN/GND des MAX löten, Minus an GND.</w:t>
+        <w:t xml:space="preserve">Den MAX98357A mit seiner 7-poligen Stiftleiste so auf die Versorgungsreihe setzen, dass VIN auf 5V und LRC auf IO4 liegt (Bild 3). Vor dem Löten prüfen: VIN auf 5V und GND auf GND. Den SD-Stift weglassen, damit 3V3 frei bleibt.</w:t>
       </w:r>
     </w:p>
     <w:p>
@@ -5595,7 +4741,7 @@
           <w:sz w:val="22"/>
           <w:szCs w:val="22"/>
         </w:rPr>
-        <w:t xml:space="preserve">Gleiches Schema wie Port A. Für S.Port die Diode nach Bild 5 einsetzen.</w:t>
+        <w:t xml:space="preserve">Je eine 2-polige Stiftleiste mit RX und TX nach Bild 4.</w:t>
       </w:r>
     </w:p>
     <w:p>
@@ -5615,7 +4761,7 @@
           <w:sz w:val="22"/>
           <w:szCs w:val="22"/>
         </w:rPr>
-        <w:t xml:space="preserve">SD-Modul (optional). </w:t>
+        <w:t xml:space="preserve">WLAN-Brücke. </w:t>
       </w:r>
       <w:r>
         <w:rPr>
@@ -5623,7 +4769,7 @@
           <w:sz w:val="22"/>
           <w:szCs w:val="22"/>
         </w:rPr>
-        <w:t xml:space="preserve">CS, MOSI, SCK, MISO an GPIO10–13, Versorgung je nach Modul an 3V3 oder +5V.</w:t>
+        <w:t xml:space="preserve">Zwei Pins: GPIO9 und GND. Jumper gesteckt beim Einschalten = WLAN geht an.</w:t>
       </w:r>
     </w:p>
     <w:p>
@@ -5643,7 +4789,7 @@
           <w:sz w:val="22"/>
           <w:szCs w:val="22"/>
         </w:rPr>
-        <w:t xml:space="preserve">WLAN-Brücke. </w:t>
+        <w:t xml:space="preserve">Sichtprüfung und Messen. </w:t>
       </w:r>
       <w:r>
         <w:rPr>
@@ -5651,7 +4797,7 @@
           <w:sz w:val="22"/>
           <w:szCs w:val="22"/>
         </w:rPr>
-        <w:t xml:space="preserve">Zwei Pins: GPIO9 und GND. Jumper gesteckt beim Einschalten = WLAN geht an.</w:t>
+        <w:t xml:space="preserve">Lötstellen ansehen, mit dem Multimeter zwischen +5V und GND auf Kurzschluss prüfen (Durchgang darf nicht piepen).</w:t>
       </w:r>
     </w:p>
     <w:p>
@@ -5671,7 +4817,7 @@
           <w:sz w:val="22"/>
           <w:szCs w:val="22"/>
         </w:rPr>
-        <w:t xml:space="preserve">Sichtprüfung und Messen. </w:t>
+        <w:t xml:space="preserve">Erster Start ohne Lautsprecher. </w:t>
       </w:r>
       <w:r>
         <w:rPr>
@@ -5679,34 +4825,6 @@
           <w:sz w:val="22"/>
           <w:szCs w:val="22"/>
         </w:rPr>
-        <w:t xml:space="preserve">Lötstellen ansehen, mit dem Multimeter zwischen +5V und GND auf Kurzschluss prüfen (Durchgang darf nicht piepen).</w:t>
-      </w:r>
-    </w:p>
-    <w:p>
-      <w:pPr>
-        <w:pStyle w:val="ListParagraph"/>
-        <w:numPr>
-          <w:ilvl w:val="0"/>
-          <w:numId w:val="3"/>
-        </w:numPr>
-        <w:spacing w:after="100"/>
-      </w:pPr>
-      <w:r>
-        <w:rPr>
-          <w:rFonts w:ascii="Arial" w:cs="Arial" w:eastAsia="Arial" w:hAnsi="Arial"/>
-          <w:b/>
-          <w:bCs/>
-          <w:sz w:val="22"/>
-          <w:szCs w:val="22"/>
-        </w:rPr>
-        <w:t xml:space="preserve">Erster Start ohne Lautsprecher. </w:t>
-      </w:r>
-      <w:r>
-        <w:rPr>
-          <w:rFonts w:ascii="Arial" w:cs="Arial" w:eastAsia="Arial" w:hAnsi="Arial"/>
-          <w:sz w:val="22"/>
-          <w:szCs w:val="22"/>
-        </w:rPr>
         <w:t xml:space="preserve">ESP stecken, über USB starten, Konsole beobachten. Dann Lautsprecher anschließen und mit BEC starten.</w:t>
       </w:r>
     </w:p>
@@ -5719,7 +4837,7 @@
         <w:rPr>
           <w:rFonts w:ascii="Arial" w:cs="Arial" w:eastAsia="Arial" w:hAnsi="Arial"/>
         </w:rPr>
-        <w:t xml:space="preserve">10. Inbetriebnahme</w:t>
+        <w:t xml:space="preserve">9. Inbetriebnahme</w:t>
       </w:r>
     </w:p>
     <w:p>
@@ -5822,7 +4940,7 @@
           <w:sz w:val="22"/>
           <w:szCs w:val="22"/>
         </w:rPr>
-        <w:t xml:space="preserve">Test: Motor über Gas starten, Zusatzsounds schalten, Lautstärke anpassen. Bei Port B/C die Telemetrie am Sender prüfen.</w:t>
+        <w:t xml:space="preserve">Test: Motor über Gas starten, Zusatzsounds schalten, Lautstärke anpassen.</w:t>
       </w:r>
     </w:p>
     <w:p>
@@ -5834,7 +4952,7 @@
         <w:rPr>
           <w:rFonts w:ascii="Arial" w:cs="Arial" w:eastAsia="Arial" w:hAnsi="Arial"/>
         </w:rPr>
-        <w:t xml:space="preserve">11. Offene Punkte</w:t>
+        <w:t xml:space="preserve">10. Offene Punkte</w:t>
       </w:r>
     </w:p>
     <w:p>
@@ -5871,6 +4989,24 @@
           <w:szCs w:val="22"/>
         </w:rPr>
         <w:t xml:space="preserve">Schaltplan und Platine in KiCad (Ordner hardware/), wenn der Lochraster-Aufbau getestet ist.</w:t>
+      </w:r>
+    </w:p>
+    <w:p>
+      <w:pPr>
+        <w:pStyle w:val="ListParagraph"/>
+        <w:numPr>
+          <w:ilvl w:val="0"/>
+          <w:numId w:val="2"/>
+        </w:numPr>
+        <w:spacing w:after="80"/>
+      </w:pPr>
+      <w:r>
+        <w:rPr>
+          <w:rFonts w:ascii="Arial" w:cs="Arial" w:eastAsia="Arial" w:hAnsi="Arial"/>
+          <w:sz w:val="22"/>
+          <w:szCs w:val="22"/>
+        </w:rPr>
+        <w:t xml:space="preserve">Funktionen von Port B und Port C festlegen.</w:t>
       </w:r>
     </w:p>
     <w:p>

</xml_diff>

<commit_message>
v0.05: WLAN per BOOT-Taste statt WLAN-Bruecke an GPIO9
Ist "WLAN dauerhaft an" aus, wartet die Firmware nach dem Start 3 s
auf die BOOT-Taste (GPIO0, LED blinkt blau) und schaltet dann das WLAN
ein. GPIO9 und der Jumper entfallen. README, Hardware-Bauplan (Text,
Tabellen, Bilder) und Projektbeschreibung auf Stand v0.05.

Co-Authored-By: Claude Opus 5.5 <noreply@anthropic.com>
Claude-Session: https://claude.ai/code/session_01JXJ2Td9EZV44BujZPFUYxn
</commit_message>
<xml_diff>
--- a/docs/Hardware-Bauplan_Mini-S3.docx
+++ b/docs/Hardware-Bauplan_Mini-S3.docx
@@ -43,7 +43,7 @@
           <w:sz w:val="20"/>
           <w:szCs w:val="20"/>
         </w:rPr>
-        <w:t xml:space="preserve">Waveshare ESP32-S3-Zero · ESP32-S3FH4R2 (4 MB Flash, 2 MB PSRAM) · Stand 18.10.2026 · Entwurf</w:t>
+        <w:t>Waveshare ESP32-S3-Zero · ESP32-S3FH4R2 (4 MB Flash, 2 MB PSRAM) · Stand 26.10.2026 (Firmware v0.05) · Entwurf</w:t>
       </w:r>
     </w:p>
     <w:tbl>
@@ -1016,101 +1016,6 @@
               <w:bottom w:val="single" w:color="CBD5E1" w:sz="4"/>
               <w:right w:val="single" w:color="CBD5E1" w:sz="4"/>
             </w:tcBorders>
-            <w:shd w:fill="F1F5F9" w:color="auto" w:val="clear"/>
-            <w:tcMar>
-              <w:top w:type="dxa" w:w="60"/>
-              <w:left w:type="dxa" w:w="100"/>
-              <w:bottom w:type="dxa" w:w="60"/>
-              <w:right w:type="dxa" w:w="100"/>
-            </w:tcMar>
-          </w:tcPr>
-          <w:p>
-            <w:r>
-              <w:rPr>
-                <w:rFonts w:ascii="Arial" w:cs="Arial" w:eastAsia="Arial" w:hAnsi="Arial"/>
-                <w:b w:val="false"/>
-                <w:bCs w:val="false"/>
-                <w:color w:val="0F172A"/>
-                <w:sz w:val="19"/>
-                <w:szCs w:val="19"/>
-              </w:rPr>
-              <w:t xml:space="preserve">1</w:t>
-            </w:r>
-          </w:p>
-        </w:tc>
-        <w:tc>
-          <w:tcPr>
-            <w:tcW w:type="dxa" w:w="3900"/>
-            <w:tcBorders>
-              <w:top w:val="single" w:color="CBD5E1" w:sz="4"/>
-              <w:left w:val="single" w:color="CBD5E1" w:sz="4"/>
-              <w:bottom w:val="single" w:color="CBD5E1" w:sz="4"/>
-              <w:right w:val="single" w:color="CBD5E1" w:sz="4"/>
-            </w:tcBorders>
-            <w:shd w:fill="F1F5F9" w:color="auto" w:val="clear"/>
-            <w:tcMar>
-              <w:top w:type="dxa" w:w="60"/>
-              <w:left w:type="dxa" w:w="100"/>
-              <w:bottom w:type="dxa" w:w="60"/>
-              <w:right w:type="dxa" w:w="100"/>
-            </w:tcMar>
-          </w:tcPr>
-          <w:p>
-            <w:r>
-              <w:rPr>
-                <w:rFonts w:ascii="Arial" w:cs="Arial" w:eastAsia="Arial" w:hAnsi="Arial"/>
-                <w:b w:val="false"/>
-                <w:bCs w:val="false"/>
-                <w:color w:val="0F172A"/>
-                <w:sz w:val="19"/>
-                <w:szCs w:val="19"/>
-              </w:rPr>
-              <w:t xml:space="preserve">Stiftleiste 2-polig + Jumper</w:t>
-            </w:r>
-          </w:p>
-        </w:tc>
-        <w:tc>
-          <w:tcPr>
-            <w:tcW w:type="dxa" w:w="4226"/>
-            <w:tcBorders>
-              <w:top w:val="single" w:color="CBD5E1" w:sz="4"/>
-              <w:left w:val="single" w:color="CBD5E1" w:sz="4"/>
-              <w:bottom w:val="single" w:color="CBD5E1" w:sz="4"/>
-              <w:right w:val="single" w:color="CBD5E1" w:sz="4"/>
-            </w:tcBorders>
-            <w:shd w:fill="F1F5F9" w:color="auto" w:val="clear"/>
-            <w:tcMar>
-              <w:top w:type="dxa" w:w="60"/>
-              <w:left w:type="dxa" w:w="100"/>
-              <w:bottom w:type="dxa" w:w="60"/>
-              <w:right w:type="dxa" w:w="100"/>
-            </w:tcMar>
-          </w:tcPr>
-          <w:p>
-            <w:r>
-              <w:rPr>
-                <w:rFonts w:ascii="Arial" w:cs="Arial" w:eastAsia="Arial" w:hAnsi="Arial"/>
-                <w:b w:val="false"/>
-                <w:bCs w:val="false"/>
-                <w:color w:val="0F172A"/>
-                <w:sz w:val="19"/>
-                <w:szCs w:val="19"/>
-              </w:rPr>
-              <w:t xml:space="preserve">WLAN-Brücke</w:t>
-            </w:r>
-          </w:p>
-        </w:tc>
-      </w:tr>
-      <w:tr>
-        <w:tc>
-          <w:tcPr>
-            <w:tcW w:type="dxa" w:w="900"/>
-            <w:tcBorders>
-              <w:top w:val="single" w:color="CBD5E1" w:sz="4"/>
-              <w:left w:val="single" w:color="CBD5E1" w:sz="4"/>
-              <w:bottom w:val="single" w:color="CBD5E1" w:sz="4"/>
-              <w:right w:val="single" w:color="CBD5E1" w:sz="4"/>
-            </w:tcBorders>
             <w:tcMar>
               <w:top w:type="dxa" w:w="60"/>
               <w:left w:type="dxa" w:w="100"/>
@@ -3310,7 +3215,7 @@
                 <w:sz w:val="19"/>
                 <w:szCs w:val="19"/>
               </w:rPr>
-              <w:t xml:space="preserve">WLAN-Brücke</w:t>
+              <w:t>WLAN-Taste</w:t>
             </w:r>
           </w:p>
         </w:tc>
@@ -3341,7 +3246,7 @@
                 <w:sz w:val="19"/>
                 <w:szCs w:val="19"/>
               </w:rPr>
-              <w:t xml:space="preserve">GPIO9</w:t>
+              <w:t>GPIO0 (BOOT)</w:t>
             </w:r>
           </w:p>
         </w:tc>
@@ -3372,7 +3277,7 @@
                 <w:sz w:val="19"/>
                 <w:szCs w:val="19"/>
               </w:rPr>
-              <w:t xml:space="preserve">Eingang (Pull-up)</w:t>
+              <w:t>Eingang (Pull-up)</w:t>
             </w:r>
           </w:p>
         </w:tc>
@@ -3403,7 +3308,7 @@
                 <w:sz w:val="19"/>
                 <w:szCs w:val="19"/>
               </w:rPr>
-              <w:t xml:space="preserve">Brücke nach GND</w:t>
+              <w:t>BOOT-Taste auf dem Board</w:t>
             </w:r>
           </w:p>
         </w:tc>
@@ -3434,7 +3339,7 @@
                 <w:sz w:val="19"/>
                 <w:szCs w:val="19"/>
               </w:rPr>
-              <w:t xml:space="preserve">gesteckt beim Einschalten = WLAN an</w:t>
+              <w:t>nach dem Start 3 s lang drücken = WLAN an</w:t>
             </w:r>
           </w:p>
         </w:tc>
@@ -3496,7 +3401,7 @@
                 <w:sz w:val="19"/>
                 <w:szCs w:val="19"/>
               </w:rPr>
-              <w:t xml:space="preserve">GPIO10–13</w:t>
+              <w:t>GPIO9–13</w:t>
             </w:r>
           </w:p>
         </w:tc>
@@ -3964,7 +3869,7 @@
           <w:sz w:val="22"/>
           <w:szCs w:val="22"/>
         </w:rPr>
-        <w:t xml:space="preserve">GPIO 0, 45 und 46 sind Strapping-Pins und bleiben frei. GPIO 3 (BCLK) ist nur für die JTAG-Auswahl per eFuse ein Strapping-Pin und hier unkritisch.</w:t>
+        <w:t>GPIO 0, 45 und 46 sind Strapping-Pins und werden nicht verdrahtet. GPIO 0 ist die BOOT-Taste auf dem Board; die Firmware nutzt sie nach dem Start als WLAN-Taste. GPIO 3 (BCLK) ist nur für die JTAG-Auswahl per eFuse ein Strapping-Pin und hier unkritisch.</w:t>
       </w:r>
     </w:p>
     <w:p>
@@ -4761,7 +4666,7 @@
           <w:sz w:val="22"/>
           <w:szCs w:val="22"/>
         </w:rPr>
-        <w:t xml:space="preserve">WLAN-Brücke. </w:t>
+        <w:t xml:space="preserve">BOOT-Taste erreichbar lassen. </w:t>
       </w:r>
       <w:r>
         <w:rPr>
@@ -4769,7 +4674,7 @@
           <w:sz w:val="22"/>
           <w:szCs w:val="22"/>
         </w:rPr>
-        <w:t xml:space="preserve">Zwei Pins: GPIO9 und GND. Jumper gesteckt beim Einschalten = WLAN geht an.</w:t>
+        <w:t>Die BOOT-Taste des ESP-Boards ist die WLAN-Taste. Das Board so einbauen, dass man sie auch im Modell noch drücken kann. Eine WLAN-Brücke oder ein Jumper ist seit Firmware v0.05 nicht mehr nötig.</w:t>
       </w:r>
     </w:p>
     <w:p>
@@ -4886,7 +4791,43 @@
           <w:sz w:val="22"/>
           <w:szCs w:val="22"/>
         </w:rPr>
-        <w:t xml:space="preserve">WLAN: Das Modul öffnet beim ersten Start einen Access Point „Sound-Mini“ (Passwort 123456789). Weboberfläche: http://192.168.1.1</w:t>
+        <w:t>WLAN: Das Modul öffnet einen Access Point „Sound-Mini“ (Passwort 123456789). Weboberfläche: http://192.168.1.1. Ab Werk ist „WLAN dauerhaft an“ eingeschaltet, das WLAN ist also nach jedem Start sofort da.</w:t>
+      </w:r>
+    </w:p>
+    <w:p>
+      <w:pPr>
+        <w:pStyle w:val="ListParagraph"/>
+        <w:numPr>
+          <w:ilvl w:val="0"/>
+          <w:numId w:val="4"/>
+        </w:numPr>
+        <w:spacing w:after="100"/>
+      </w:pPr>
+      <w:r>
+        <w:rPr>
+          <w:rFonts w:ascii="Arial" w:cs="Arial" w:eastAsia="Arial" w:hAnsi="Arial"/>
+          <w:sz w:val="22"/>
+          <w:szCs w:val="22"/>
+        </w:rPr>
+        <w:t>WLAN einschalten, wenn „WLAN dauerhaft an“ aus ist: Nach dem Einschalten blinkt die LED 3 Sekunden lang blau. In dieser Zeit die BOOT-Taste kurz drücken, dann geht das WLAN an. Die Taste nicht schon beim Einschalten gedrückt halten, sonst startet der ESP im Flash-Modus (dann einfach neu einschalten).</w:t>
+      </w:r>
+    </w:p>
+    <w:p>
+      <w:pPr>
+        <w:pStyle w:val="ListParagraph"/>
+        <w:numPr>
+          <w:ilvl w:val="0"/>
+          <w:numId w:val="4"/>
+        </w:numPr>
+        <w:spacing w:after="100"/>
+      </w:pPr>
+      <w:r>
+        <w:rPr>
+          <w:rFonts w:ascii="Arial" w:cs="Arial" w:eastAsia="Arial" w:hAnsi="Arial"/>
+          <w:sz w:val="22"/>
+          <w:szCs w:val="22"/>
+        </w:rPr>
+        <w:t>Ohne Taste geht es auch über den Sender: im ExpressLRS-Lua-Skript beim Soundmodul unter „Einstellungen“ den Punkt „WLAN jetzt“ auf „Ein“ stellen. Das gilt bis zum nächsten Ausschalten. Dort lassen sich auch „WLAN dauerhaft an“ und „Auto-WLAN bei Signalverlust“ einstellen.</w:t>
       </w:r>
     </w:p>
     <w:p>

</xml_diff>